<commit_message>
Architecture documents 1.1: all eleven rebuilt for the current system
Sources 07 to 11 and the glossary updated (housekeeping job, migration lock,
settings refresh across instances, scheduler in Manila time, broker roles,
deployment package). Landscape figures now carry their heading and the short
text after them, which saves blank pages. New tools/check_style.py checks the
wording of the sources and the built files.
</commit_message>
<xml_diff>
--- a/docs/architecture/04_BrokerVerse_Technology_Stack.docx
+++ b/docs/architecture/04_BrokerVerse_Technology_Stack.docx
@@ -92,7 +92,7 @@
                 <w:color w:val="FFFFFF"/>
                 <w:sz w:val="80"/>
               </w:rPr>
-              <w:t>BrokerVerse</w:t>
+              <w:t>BrokerVerse OOTB</w:t>
             </w:r>
           </w:p>
           <w:p>
@@ -107,7 +107,7 @@
                 <w:color w:val="EAF6FD"/>
                 <w:sz w:val="26"/>
               </w:rPr>
-              <w:t>Out-of-the-box insurance broking platform</w:t>
+              <w:t>Insurance broking platform by iorta TechNXT</w:t>
             </w:r>
           </w:p>
           <w:p>
@@ -233,7 +233,7 @@
                 <w:rFonts w:eastAsia="Nunito" w:cs="Nunito"/>
                 <w:sz w:val="19"/>
               </w:rPr>
-              <w:t>BrokerVerse</w:t>
+              <w:t>BrokerVerse OOTB</w:t>
             </w:r>
           </w:p>
         </w:tc>
@@ -357,7 +357,7 @@
                 <w:rFonts w:eastAsia="Nunito" w:cs="Nunito"/>
                 <w:sz w:val="19"/>
               </w:rPr>
-              <w:t>1.0</w:t>
+              <w:t>1.1</w:t>
             </w:r>
           </w:p>
         </w:tc>
@@ -671,7 +671,7 @@
                 <w:rFonts w:eastAsia="Nunito" w:cs="Nunito"/>
                 <w:sz w:val="19"/>
               </w:rPr>
-              <w:t>BrokerVerse Solution Architecture: 04 Technology Stack</w:t>
+              <w:t>BrokerVerse OOTB Solution Architecture: 04 Technology Stack</w:t>
             </w:r>
           </w:p>
         </w:tc>
@@ -795,7 +795,7 @@
                 <w:rFonts w:eastAsia="Nunito" w:cs="Nunito"/>
                 <w:sz w:val="19"/>
               </w:rPr>
-              <w:t>1.0</w:t>
+              <w:t>1.1</w:t>
             </w:r>
           </w:p>
         </w:tc>
@@ -1043,7 +1043,7 @@
                 <w:rFonts w:eastAsia="Nunito" w:cs="Nunito"/>
                 <w:sz w:val="19"/>
               </w:rPr>
-              <w:t>BrokerVerse source repository, branch brokerverse-platform (backend/, brokerverse/, docker-compose.yml, render.yaml, docs/)</w:t>
+              <w:t>BrokerVerse source repository, branch brokerverse-platform (backend/, brokerverse/, deploy/, docker-compose.yml, .github/workflows, docs/)</w:t>
             </w:r>
           </w:p>
         </w:tc>
@@ -1300,6 +1300,111 @@
                 <w:sz w:val="18"/>
               </w:rPr>
               <w:t>Initial issue</w:t>
+            </w:r>
+          </w:p>
+        </w:tc>
+      </w:tr>
+      <w:tr>
+        <w:trPr>
+          <w:cantSplit w:val="true"/>
+        </w:trPr>
+        <w:tc>
+          <w:tcPr>
+            <w:tcW w:w="1156" w:type="dxa"/>
+            <w:tcBorders>
+              <w:top w:val="single" w:sz="4" w:space="0" w:color="C9D6E3"/>
+              <w:left w:val="single" w:sz="4" w:space="0" w:color="C9D6E3"/>
+              <w:bottom w:val="single" w:sz="4" w:space="0" w:color="C9D6E3"/>
+              <w:right w:val="single" w:sz="4" w:space="0" w:color="C9D6E3"/>
+            </w:tcBorders>
+            <w:shd w:color="auto" w:fill="F3F9FE" w:val="clear"/>
+          </w:tcPr>
+          <w:p>
+            <w:pPr>
+              <w:pStyle w:val="TableText"/>
+              <w:rPr/>
+            </w:pPr>
+            <w:r>
+              <w:rPr>
+                <w:rFonts w:eastAsia="Nunito" w:cs="Nunito"/>
+                <w:sz w:val="18"/>
+              </w:rPr>
+              <w:t>1.1</w:t>
+            </w:r>
+          </w:p>
+        </w:tc>
+        <w:tc>
+          <w:tcPr>
+            <w:tcW w:w="1734" w:type="dxa"/>
+            <w:tcBorders>
+              <w:top w:val="single" w:sz="4" w:space="0" w:color="C9D6E3"/>
+              <w:left w:val="single" w:sz="4" w:space="0" w:color="C9D6E3"/>
+              <w:bottom w:val="single" w:sz="4" w:space="0" w:color="C9D6E3"/>
+              <w:right w:val="single" w:sz="4" w:space="0" w:color="C9D6E3"/>
+            </w:tcBorders>
+            <w:shd w:color="auto" w:fill="F3F9FE" w:val="clear"/>
+          </w:tcPr>
+          <w:p>
+            <w:pPr>
+              <w:pStyle w:val="TableText"/>
+              <w:rPr/>
+            </w:pPr>
+            <w:r>
+              <w:rPr>
+                <w:rFonts w:eastAsia="Nunito" w:cs="Nunito"/>
+                <w:sz w:val="18"/>
+              </w:rPr>
+              <w:t>29 September 2026</w:t>
+            </w:r>
+          </w:p>
+        </w:tc>
+        <w:tc>
+          <w:tcPr>
+            <w:tcW w:w="1927" w:type="dxa"/>
+            <w:tcBorders>
+              <w:top w:val="single" w:sz="4" w:space="0" w:color="C9D6E3"/>
+              <w:left w:val="single" w:sz="4" w:space="0" w:color="C9D6E3"/>
+              <w:bottom w:val="single" w:sz="4" w:space="0" w:color="C9D6E3"/>
+              <w:right w:val="single" w:sz="4" w:space="0" w:color="C9D6E3"/>
+            </w:tcBorders>
+            <w:shd w:color="auto" w:fill="F3F9FE" w:val="clear"/>
+          </w:tcPr>
+          <w:p>
+            <w:pPr>
+              <w:pStyle w:val="TableText"/>
+              <w:rPr/>
+            </w:pPr>
+            <w:r>
+              <w:rPr>
+                <w:rFonts w:eastAsia="Nunito" w:cs="Nunito"/>
+                <w:sz w:val="18"/>
+              </w:rPr>
+              <w:t>iorta TechNXT</w:t>
+            </w:r>
+          </w:p>
+        </w:tc>
+        <w:tc>
+          <w:tcPr>
+            <w:tcW w:w="4819" w:type="dxa"/>
+            <w:tcBorders>
+              <w:top w:val="single" w:sz="4" w:space="0" w:color="C9D6E3"/>
+              <w:left w:val="single" w:sz="4" w:space="0" w:color="C9D6E3"/>
+              <w:bottom w:val="single" w:sz="4" w:space="0" w:color="C9D6E3"/>
+              <w:right w:val="single" w:sz="4" w:space="0" w:color="C9D6E3"/>
+            </w:tcBorders>
+            <w:shd w:color="auto" w:fill="F3F9FE" w:val="clear"/>
+          </w:tcPr>
+          <w:p>
+            <w:pPr>
+              <w:pStyle w:val="TableText"/>
+              <w:rPr/>
+            </w:pPr>
+            <w:r>
+              <w:rPr>
+                <w:rFonts w:eastAsia="Nunito" w:cs="Nunito"/>
+                <w:sz w:val="18"/>
+              </w:rPr>
+              <w:t>Updated to the current system: placement journey, co-insurance, posting rules, period end and BIR tax, bank reconciliation, document numbering, commission rate matrix, single PDF engine, uploads and go-live imports, housekeeping, business time zone, broker roles, deployment on the BrokerVerse URL</w:t>
             </w:r>
           </w:p>
         </w:tc>
@@ -2005,7 +2110,7 @@
             </w:rPr>
             <w:fldChar w:fldCharType="separate"/>
           </w:r>
-          <w:hyperlink w:anchor="__RefHeading___Toc11107_3826153650">
+          <w:hyperlink w:anchor="__RefHeading___Toc7528_4084622315">
             <w:r>
               <w:rPr>
                 <w:webHidden/>
@@ -2026,7 +2131,7 @@
             </w:tabs>
             <w:rPr/>
           </w:pPr>
-          <w:hyperlink w:anchor="__RefHeading___Toc11109_3826153650">
+          <w:hyperlink w:anchor="__RefHeading___Toc7530_4084622315">
             <w:r>
               <w:rPr>
                 <w:webHidden/>
@@ -2047,7 +2152,7 @@
             </w:tabs>
             <w:rPr/>
           </w:pPr>
-          <w:hyperlink w:anchor="__RefHeading___Toc11111_3826153650">
+          <w:hyperlink w:anchor="__RefHeading___Toc7532_4084622315">
             <w:r>
               <w:rPr>
                 <w:webHidden/>
@@ -2068,7 +2173,7 @@
             </w:tabs>
             <w:rPr/>
           </w:pPr>
-          <w:hyperlink w:anchor="__RefHeading___Toc11113_3826153650">
+          <w:hyperlink w:anchor="__RefHeading___Toc7534_4084622315">
             <w:r>
               <w:rPr>
                 <w:webHidden/>
@@ -2089,7 +2194,7 @@
             </w:tabs>
             <w:rPr/>
           </w:pPr>
-          <w:hyperlink w:anchor="__RefHeading___Toc11115_3826153650">
+          <w:hyperlink w:anchor="__RefHeading___Toc7536_4084622315">
             <w:r>
               <w:rPr>
                 <w:webHidden/>
@@ -2110,7 +2215,7 @@
             </w:tabs>
             <w:rPr/>
           </w:pPr>
-          <w:hyperlink w:anchor="__RefHeading___Toc11117_3826153650">
+          <w:hyperlink w:anchor="__RefHeading___Toc7538_4084622315">
             <w:r>
               <w:rPr>
                 <w:webHidden/>
@@ -2131,7 +2236,7 @@
             </w:tabs>
             <w:rPr/>
           </w:pPr>
-          <w:hyperlink w:anchor="__RefHeading___Toc11119_3826153650">
+          <w:hyperlink w:anchor="__RefHeading___Toc7540_4084622315">
             <w:r>
               <w:rPr>
                 <w:webHidden/>
@@ -2152,7 +2257,7 @@
             </w:tabs>
             <w:rPr/>
           </w:pPr>
-          <w:hyperlink w:anchor="__RefHeading___Toc11121_3826153650">
+          <w:hyperlink w:anchor="__RefHeading___Toc7542_4084622315">
             <w:r>
               <w:rPr>
                 <w:webHidden/>
@@ -2173,7 +2278,7 @@
             </w:tabs>
             <w:rPr/>
           </w:pPr>
-          <w:hyperlink w:anchor="__RefHeading___Toc11123_3826153650">
+          <w:hyperlink w:anchor="__RefHeading___Toc7544_4084622315">
             <w:r>
               <w:rPr>
                 <w:webHidden/>
@@ -2194,7 +2299,7 @@
             </w:tabs>
             <w:rPr/>
           </w:pPr>
-          <w:hyperlink w:anchor="__RefHeading___Toc11125_3826153650">
+          <w:hyperlink w:anchor="__RefHeading___Toc7546_4084622315">
             <w:r>
               <w:rPr>
                 <w:webHidden/>
@@ -2215,7 +2320,7 @@
             </w:tabs>
             <w:rPr/>
           </w:pPr>
-          <w:hyperlink w:anchor="__RefHeading___Toc11127_3826153650">
+          <w:hyperlink w:anchor="__RefHeading___Toc7548_4084622315">
             <w:r>
               <w:rPr>
                 <w:webHidden/>
@@ -2236,7 +2341,7 @@
             </w:tabs>
             <w:rPr/>
           </w:pPr>
-          <w:hyperlink w:anchor="__RefHeading___Toc11129_3826153650">
+          <w:hyperlink w:anchor="__RefHeading___Toc7550_4084622315">
             <w:r>
               <w:rPr>
                 <w:webHidden/>
@@ -2257,7 +2362,7 @@
             </w:tabs>
             <w:rPr/>
           </w:pPr>
-          <w:hyperlink w:anchor="__RefHeading___Toc11131_3826153650">
+          <w:hyperlink w:anchor="__RefHeading___Toc7552_4084622315">
             <w:r>
               <w:rPr>
                 <w:webHidden/>
@@ -2278,7 +2383,7 @@
             </w:tabs>
             <w:rPr/>
           </w:pPr>
-          <w:hyperlink w:anchor="__RefHeading___Toc11133_3826153650">
+          <w:hyperlink w:anchor="__RefHeading___Toc7554_4084622315">
             <w:r>
               <w:rPr>
                 <w:webHidden/>
@@ -2309,7 +2414,7 @@
       <w:r>
         <w:br w:type="page"/>
       </w:r>
-      <w:bookmarkStart w:id="0" w:name="__RefHeading___Toc11107_3826153650"/>
+      <w:bookmarkStart w:id="0" w:name="__RefHeading___Toc7528_4084622315"/>
       <w:bookmarkEnd w:id="0"/>
       <w:r>
         <w:rPr>
@@ -2323,7 +2428,7 @@
         <w:pStyle w:val="Heading2"/>
         <w:rPr/>
       </w:pPr>
-      <w:bookmarkStart w:id="1" w:name="__RefHeading___Toc11109_3826153650"/>
+      <w:bookmarkStart w:id="1" w:name="__RefHeading___Toc7530_4084622315"/>
       <w:bookmarkEnd w:id="1"/>
       <w:r>
         <w:rPr>
@@ -2341,7 +2446,7 @@
         <w:rPr>
           <w:rFonts w:eastAsia="Nunito" w:cs="Nunito"/>
         </w:rPr>
-        <w:t>This document lists the technologies used by BrokerVerse, with the versions resolved in the lock files of the baseline, their purpose and their licence type, together with the runtime, infrastructure, build and test tooling. It is the reference for dependency management, security patching and licence review.</w:t>
+        <w:t>This document lists the technologies used by BrokerVerse OOTB, with the versions resolved in the lock files of the baseline, their purpose and their licence type, together with the runtime, infrastructure, build and test tooling. It is the reference for dependency management, security patching and licence review.</w:t>
       </w:r>
     </w:p>
     <w:p>
@@ -2473,7 +2578,7 @@
           <w:color w:val="0B3D7A"/>
           <w:sz w:val="18"/>
         </w:rPr>
-        <w:t>render.yaml</w:t>
+        <w:t>.github/workflows/ci.yml</w:t>
       </w:r>
       <w:r>
         <w:rPr>
@@ -2501,13 +2606,13 @@
           <w:color w:val="0B3D7A"/>
           <w:sz w:val="18"/>
         </w:rPr>
-        <w:t>docs/GO_LIVE_CHECKLIST.md</w:t>
+        <w:t>deploy/README.md</w:t>
       </w:r>
       <w:r>
         <w:rPr>
           <w:rFonts w:eastAsia="Nunito" w:cs="Nunito"/>
         </w:rPr>
-        <w:t xml:space="preserve">. Versions are the exact versions in the lock files (the manifests use caret ranges; </w:t>
+        <w:t xml:space="preserve">. Versions are the exact versions in the lock files; the manifests use caret ranges and </w:t>
       </w:r>
       <w:r>
         <w:rPr>
@@ -2521,7 +2626,7 @@
         <w:rPr>
           <w:rFonts w:eastAsia="Nunito" w:cs="Nunito"/>
         </w:rPr>
-        <w:t xml:space="preserve"> installs the locked versions).</w:t>
+        <w:t xml:space="preserve"> installs the locked versions.</w:t>
       </w:r>
     </w:p>
     <w:p>
@@ -2529,7 +2634,7 @@
         <w:pStyle w:val="Heading2"/>
         <w:rPr/>
       </w:pPr>
-      <w:bookmarkStart w:id="2" w:name="__RefHeading___Toc11111_3826153650"/>
+      <w:bookmarkStart w:id="2" w:name="__RefHeading___Toc7532_4084622315"/>
       <w:bookmarkEnd w:id="2"/>
       <w:r>
         <w:rPr>
@@ -2666,7 +2771,7 @@
                 <w:rFonts w:eastAsia="Nunito" w:cs="Nunito"/>
                 <w:sz w:val="17"/>
               </w:rPr>
-              <w:t xml:space="preserve">Modern evergreen browsers (build targets </w:t>
+              <w:t xml:space="preserve">Current evergreen browsers (build targets </w:t>
             </w:r>
             <w:r>
               <w:rPr>
@@ -2736,7 +2841,7 @@
                 <w:rFonts w:eastAsia="Nunito" w:cs="Nunito"/>
                 <w:sz w:val="17"/>
               </w:rPr>
-              <w:t>React 18.2 single-page application, PrimeReact 10 / PrimeFlex / PrimeIcons, Redux Toolkit 2, React Router 6, Formik, i18next, axios, Chart.js, FullCalendar, Sass; built with Create React App 5 (react-scripts) and craco 7</w:t>
+              <w:t>React 18.2 single-page application, PrimeReact 10, PrimeFlex, PrimeIcons, Redux Toolkit 2, React Router 6, Formik, i18next, axios, Chart.js, FullCalendar, Sass; built with Create React App 5 (react-scripts) and craco 7</w:t>
             </w:r>
           </w:p>
         </w:tc>
@@ -2789,7 +2894,7 @@
                 <w:rFonts w:eastAsia="Nunito" w:cs="Nunito"/>
                 <w:sz w:val="17"/>
               </w:rPr>
-              <w:t>Amazon S3 + CloudFront (target); nginx 1.27-alpine (container option); Render static site (blueprint)</w:t>
+              <w:t>Amazon S3 and CloudFront on the existing BrokerVerse URL; nginx 1.27-alpine in the Docker Compose option</w:t>
             </w:r>
           </w:p>
         </w:tc>
@@ -2897,7 +3002,7 @@
                 <w:rFonts w:eastAsia="Nunito" w:cs="Nunito"/>
                 <w:sz w:val="17"/>
               </w:rPr>
-              <w:t xml:space="preserve">PostgreSQL 16 (local 16.13; </w:t>
+              <w:t xml:space="preserve">PostgreSQL 16 (16.13 on the build host; </w:t>
             </w:r>
             <w:r>
               <w:rPr>
@@ -2912,7 +3017,7 @@
                 <w:rFonts w:eastAsia="Nunito" w:cs="Nunito"/>
                 <w:sz w:val="17"/>
               </w:rPr>
-              <w:t xml:space="preserve"> in Docker Compose; Amazon RDS for PostgreSQL 16 target) with </w:t>
+              <w:t xml:space="preserve"> in Docker Compose and CI; Amazon RDS for PostgreSQL 16 as the production option) with </w:t>
             </w:r>
             <w:r>
               <w:rPr>
@@ -2921,6 +3026,13 @@
                 <w:sz w:val="15"/>
               </w:rPr>
               <w:t>pgcrypto</w:t>
+            </w:r>
+            <w:r>
+              <w:rPr>
+                <w:rFonts w:eastAsia="Nunito" w:cs="Nunito"/>
+                <w:sz w:val="17"/>
+              </w:rPr>
+              <w:t>; database time zone Asia/Manila</w:t>
             </w:r>
           </w:p>
         </w:tc>
@@ -2975,7 +3087,7 @@
                 <w:rFonts w:eastAsia="Nunito" w:cs="Nunito"/>
                 <w:sz w:val="17"/>
               </w:rPr>
-              <w:t>Local file system / persistent volume (</w:t>
+              <w:t xml:space="preserve">Persistent volume at </w:t>
             </w:r>
             <w:r>
               <w:rPr>
@@ -2990,7 +3102,7 @@
                 <w:rFonts w:eastAsia="Nunito" w:cs="Nunito"/>
                 <w:sz w:val="17"/>
               </w:rPr>
-              <w:t>); Amazon EFS target</w:t>
+              <w:t xml:space="preserve"> (Amazon EFS or another shared volume in production)</w:t>
             </w:r>
           </w:p>
         </w:tc>
@@ -3043,7 +3155,7 @@
                 <w:rFonts w:eastAsia="Nunito" w:cs="Nunito"/>
                 <w:sz w:val="17"/>
               </w:rPr>
-              <w:t xml:space="preserve">Any SMTP server through </w:t>
+              <w:t>Office 365 SMTP (</w:t>
             </w:r>
             <w:r>
               <w:rPr>
@@ -3051,14 +3163,22 @@
                 <w:color w:val="0B3D7A"/>
                 <w:sz w:val="15"/>
               </w:rPr>
+              <w:t>smtp.office365.com</w:t>
+            </w:r>
+            <w:r>
+              <w:rPr>
+                <w:rFonts w:eastAsia="Nunito" w:cs="Nunito"/>
+                <w:sz w:val="17"/>
+              </w:rPr>
+              <w:t xml:space="preserve">, port 587, STARTTLS) through </w:t>
+            </w:r>
+            <w:r>
+              <w:rPr>
+                <w:rFonts w:eastAsia="Liberation Mono" w:cs="Liberation Mono" w:ascii="Liberation Mono" w:hAnsi="Liberation Mono"/>
+                <w:color w:val="0B3D7A"/>
+                <w:sz w:val="15"/>
+              </w:rPr>
               <w:t>SMTP_URL</w:t>
-            </w:r>
-            <w:r>
-              <w:rPr>
-                <w:rFonts w:eastAsia="Nunito" w:cs="Nunito"/>
-                <w:sz w:val="17"/>
-              </w:rPr>
-              <w:t xml:space="preserve"> (for example Amazon SES)</w:t>
             </w:r>
           </w:p>
         </w:tc>
@@ -3128,7 +3248,7 @@
                 <w:rFonts w:eastAsia="Nunito" w:cs="Nunito"/>
                 <w:sz w:val="17"/>
               </w:rPr>
-              <w:t xml:space="preserve"> (API), </w:t>
+              <w:t xml:space="preserve"> (API) and a </w:t>
             </w:r>
             <w:r>
               <w:rPr>
@@ -3143,7 +3263,7 @@
                 <w:rFonts w:eastAsia="Nunito" w:cs="Nunito"/>
                 <w:sz w:val="17"/>
               </w:rPr>
-              <w:t xml:space="preserve"> build stage + </w:t>
+              <w:t xml:space="preserve"> build stage with an </w:t>
             </w:r>
             <w:r>
               <w:rPr>
@@ -3158,7 +3278,7 @@
                 <w:rFonts w:eastAsia="Nunito" w:cs="Nunito"/>
                 <w:sz w:val="17"/>
               </w:rPr>
-              <w:t xml:space="preserve"> (web); Docker Compose</w:t>
+              <w:t xml:space="preserve"> runtime (web); Docker Compose</w:t>
             </w:r>
           </w:p>
         </w:tc>
@@ -3211,7 +3331,37 @@
                 <w:rFonts w:eastAsia="Nunito" w:cs="Nunito"/>
                 <w:sz w:val="17"/>
               </w:rPr>
-              <w:t>GitHub Actions (front end: build, S3 sync, CloudFront invalidation); backend pipeline to be set up</w:t>
+              <w:t xml:space="preserve">GitHub Actions: </w:t>
+            </w:r>
+            <w:r>
+              <w:rPr>
+                <w:rFonts w:eastAsia="Liberation Mono" w:cs="Liberation Mono" w:ascii="Liberation Mono" w:hAnsi="Liberation Mono"/>
+                <w:color w:val="0B3D7A"/>
+                <w:sz w:val="15"/>
+              </w:rPr>
+              <w:t>.github/workflows/ci.yml</w:t>
+            </w:r>
+            <w:r>
+              <w:rPr>
+                <w:rFonts w:eastAsia="Nunito" w:cs="Nunito"/>
+                <w:sz w:val="17"/>
+              </w:rPr>
+              <w:t xml:space="preserve"> (backend lint and tests on PostgreSQL 16, front-end tests and build, backend image build) and </w:t>
+            </w:r>
+            <w:r>
+              <w:rPr>
+                <w:rFonts w:eastAsia="Liberation Mono" w:cs="Liberation Mono" w:ascii="Liberation Mono" w:hAnsi="Liberation Mono"/>
+                <w:color w:val="0B3D7A"/>
+                <w:sz w:val="15"/>
+              </w:rPr>
+              <w:t>brokerverse/.github/workflows/deploy.yml</w:t>
+            </w:r>
+            <w:r>
+              <w:rPr>
+                <w:rFonts w:eastAsia="Nunito" w:cs="Nunito"/>
+                <w:sz w:val="17"/>
+              </w:rPr>
+              <w:t xml:space="preserve"> (front-end tests, build, S3 sync, CloudFront invalidation)</w:t>
             </w:r>
           </w:p>
         </w:tc>
@@ -3266,7 +3416,7 @@
                 <w:rFonts w:eastAsia="Nunito" w:cs="Nunito"/>
                 <w:sz w:val="17"/>
               </w:rPr>
-              <w:t>AWS ap-southeast-1 (Singapore): S3, CloudFront, and for the backend ALB, ECS Fargate / App Runner / EC2, RDS, EFS, Secrets Manager / SSM, CloudWatch (recommended)</w:t>
+              <w:t>AWS ap-southeast-1 (Singapore): S3 and CloudFront for the front end; for the backend a load balancer with HTTPS, a container service (ECS Fargate, App Runner or EC2), PostgreSQL, a persistent volume and a secret store (Secrets Manager or SSM); monitoring recommended in CloudWatch</w:t>
             </w:r>
           </w:p>
         </w:tc>
@@ -3293,7 +3443,7 @@
         </w:pBdr>
         <w:rPr/>
       </w:pPr>
-      <w:bookmarkStart w:id="3" w:name="__RefHeading___Toc11113_3826153650"/>
+      <w:bookmarkStart w:id="3" w:name="__RefHeading___Toc7534_4084622315"/>
       <w:bookmarkEnd w:id="3"/>
       <w:r>
         <w:rPr>
@@ -3307,7 +3457,7 @@
         <w:pStyle w:val="Heading2"/>
         <w:rPr/>
       </w:pPr>
-      <w:bookmarkStart w:id="4" w:name="__RefHeading___Toc11115_3826153650"/>
+      <w:bookmarkStart w:id="4" w:name="__RefHeading___Toc7536_4084622315"/>
       <w:bookmarkEnd w:id="4"/>
       <w:r>
         <w:rPr>
@@ -3685,7 +3835,7 @@
                 <w:rFonts w:eastAsia="Nunito" w:cs="Nunito"/>
                 <w:sz w:val="17"/>
               </w:rPr>
-              <w:t>, max 10 connections), type parsers for numeric, bigint, date</w:t>
+              <w:t>, 10 connections), type parsers for numeric, bigint and date</w:t>
             </w:r>
           </w:p>
         </w:tc>
@@ -3906,7 +4056,22 @@
                 <w:rFonts w:eastAsia="Nunito" w:cs="Nunito"/>
                 <w:sz w:val="17"/>
               </w:rPr>
-              <w:t>Structured JSON logging with redaction</w:t>
+              <w:t>Structured JSON logging with redaction (</w:t>
+            </w:r>
+            <w:r>
+              <w:rPr>
+                <w:rFonts w:eastAsia="Liberation Mono" w:cs="Liberation Mono" w:ascii="Liberation Mono" w:hAnsi="Liberation Mono"/>
+                <w:color w:val="0B3D7A"/>
+                <w:sz w:val="15"/>
+              </w:rPr>
+              <w:t>lib/logger.js</w:t>
+            </w:r>
+            <w:r>
+              <w:rPr>
+                <w:rFonts w:eastAsia="Nunito" w:cs="Nunito"/>
+                <w:sz w:val="17"/>
+              </w:rPr>
+              <w:t>)</w:t>
             </w:r>
           </w:p>
         </w:tc>
@@ -4427,7 +4592,7 @@
                 <w:rFonts w:eastAsia="Nunito" w:cs="Nunito"/>
                 <w:sz w:val="17"/>
               </w:rPr>
-              <w:t>Password hashing (pure JavaScript bcrypt, cost 10)</w:t>
+              <w:t>Password hashing (bcrypt in JavaScript, cost 10)</w:t>
             </w:r>
           </w:p>
         </w:tc>
@@ -4738,7 +4903,7 @@
                 <w:rFonts w:eastAsia="Nunito" w:cs="Nunito"/>
                 <w:sz w:val="17"/>
               </w:rPr>
-              <w:t>Cron scheduling of the scheduled jobs</w:t>
+              <w:t>Cron scheduling of the jobs, in the business time zone</w:t>
             </w:r>
           </w:p>
         </w:tc>
@@ -4879,7 +5044,7 @@
         <w:rPr>
           <w:rFonts w:eastAsia="Nunito" w:cs="Nunito"/>
         </w:rPr>
-        <w:t>The backend has 13 direct runtime dependencies (141 packages including transitive ones, per the code review). The following are implemented in the code base instead of third-party libraries: PDF writers (</w:t>
+        <w:t>The backend has 13 direct runtime dependencies (333 packages in the lock file, including development tools). The following are part of the code base instead of third-party libraries: the PDF engine (</w:t>
       </w:r>
       <w:r>
         <w:rPr>
@@ -4887,13 +5052,13 @@
           <w:color w:val="0B3D7A"/>
           <w:sz w:val="18"/>
         </w:rPr>
-        <w:t>src/tools/pdf.js</w:t>
+        <w:t>lib/pdf</w:t>
       </w:r>
       <w:r>
         <w:rPr>
           <w:rFonts w:eastAsia="Nunito" w:cs="Nunito"/>
         </w:rPr>
-        <w:t xml:space="preserve">, </w:t>
+        <w:t>: writer, layout, tables, fonts, images) with the letterhead (</w:t>
       </w:r>
       <w:r>
         <w:rPr>
@@ -4901,13 +5066,13 @@
           <w:color w:val="0B3D7A"/>
           <w:sz w:val="18"/>
         </w:rPr>
-        <w:t>modules/documents/pdf.js</w:t>
+        <w:t>lib/letterhead.js</w:t>
       </w:r>
       <w:r>
         <w:rPr>
           <w:rFonts w:eastAsia="Nunito" w:cs="Nunito"/>
         </w:rPr>
-        <w:t>), XLSX writer (</w:t>
+        <w:t>), the XLSX writer (</w:t>
       </w:r>
       <w:r>
         <w:rPr>
@@ -4915,7 +5080,7 @@
           <w:color w:val="0B3D7A"/>
           <w:sz w:val="18"/>
         </w:rPr>
-        <w:t>tools/xlsx.js</w:t>
+        <w:t>lib/xlsx.js</w:t>
       </w:r>
       <w:r>
         <w:rPr>
@@ -4929,7 +5094,7 @@
           <w:color w:val="0B3D7A"/>
           <w:sz w:val="18"/>
         </w:rPr>
-        <w:t>tools/zip.js</w:t>
+        <w:t>lib/zip.js</w:t>
       </w:r>
       <w:r>
         <w:rPr>
@@ -4957,7 +5122,7 @@
           <w:color w:val="0B3D7A"/>
           <w:sz w:val="18"/>
         </w:rPr>
-        <w:t>tools/csv.js</w:t>
+        <w:t>lib/csv.js</w:t>
       </w:r>
       <w:r>
         <w:rPr>
@@ -5019,7 +5184,7 @@
         <w:rPr>
           <w:rFonts w:eastAsia="Nunito" w:cs="Nunito"/>
         </w:rPr>
-        <w:t>), and workbook import with inflate caps (</w:t>
+        <w:t>) and workbook import with inflate caps (</w:t>
       </w:r>
       <w:r>
         <w:rPr>
@@ -5041,7 +5206,7 @@
         <w:pStyle w:val="Heading2"/>
         <w:rPr/>
       </w:pPr>
-      <w:bookmarkStart w:id="5" w:name="__RefHeading___Toc11117_3826153650"/>
+      <w:bookmarkStart w:id="5" w:name="__RefHeading___Toc7538_4084622315"/>
       <w:bookmarkEnd w:id="5"/>
       <w:r>
         <w:rPr>
@@ -5284,7 +5449,7 @@
                 <w:rFonts w:eastAsia="Nunito" w:cs="Nunito"/>
                 <w:sz w:val="17"/>
               </w:rPr>
-              <w:t>Unit and API tests (</w:t>
+              <w:t>Integration tests against a real PostgreSQL (</w:t>
             </w:r>
             <w:r>
               <w:rPr>
@@ -5299,7 +5464,7 @@
                 <w:rFonts w:eastAsia="Nunito" w:cs="Nunito"/>
                 <w:sz w:val="17"/>
               </w:rPr>
-              <w:t>, 40 files, about 345 test cases)</w:t>
+              <w:t>, 50 files, 518 tests)</w:t>
             </w:r>
           </w:p>
         </w:tc>
@@ -5433,7 +5598,7 @@
                 <w:rFonts w:eastAsia="Nunito" w:cs="Nunito"/>
                 <w:sz w:val="17"/>
               </w:rPr>
-              <w:t>eslint, @eslint/js, globals</w:t>
+              <w:t>eslint, @eslint/js</w:t>
             </w:r>
           </w:p>
         </w:tc>
@@ -5520,7 +5685,7 @@
                 <w:rFonts w:eastAsia="Nunito" w:cs="Nunito"/>
                 <w:sz w:val="17"/>
               </w:rPr>
-              <w:t xml:space="preserve">; strict rules including </w:t>
+              <w:t xml:space="preserve">; </w:t>
             </w:r>
             <w:r>
               <w:rPr>
@@ -5535,7 +5700,7 @@
                 <w:rFonts w:eastAsia="Nunito" w:cs="Nunito"/>
                 <w:sz w:val="17"/>
               </w:rPr>
-              <w:t xml:space="preserve">, </w:t>
+              <w:t xml:space="preserve"> outside scripts, </w:t>
             </w:r>
             <w:r>
               <w:rPr>
@@ -5543,6 +5708,21 @@
                 <w:color w:val="0B3D7A"/>
                 <w:sz w:val="15"/>
               </w:rPr>
+              <w:t>no-unused-vars</w:t>
+            </w:r>
+            <w:r>
+              <w:rPr>
+                <w:rFonts w:eastAsia="Nunito" w:cs="Nunito"/>
+                <w:sz w:val="17"/>
+              </w:rPr>
+              <w:t xml:space="preserve"> and </w:t>
+            </w:r>
+            <w:r>
+              <w:rPr>
+                <w:rFonts w:eastAsia="Liberation Mono" w:cs="Liberation Mono" w:ascii="Liberation Mono" w:hAnsi="Liberation Mono"/>
+                <w:color w:val="0B3D7A"/>
+                <w:sz w:val="15"/>
+              </w:rPr>
               <w:t>eqeqeq</w:t>
             </w:r>
             <w:r>
@@ -5550,7 +5730,112 @@
                 <w:rFonts w:eastAsia="Nunito" w:cs="Nunito"/>
                 <w:sz w:val="17"/>
               </w:rPr>
-              <w:t>)</w:t>
+              <w:t xml:space="preserve"> as errors)</w:t>
+            </w:r>
+          </w:p>
+        </w:tc>
+      </w:tr>
+      <w:tr>
+        <w:trPr>
+          <w:cantSplit w:val="true"/>
+        </w:trPr>
+        <w:tc>
+          <w:tcPr>
+            <w:tcW w:w="1734" w:type="dxa"/>
+            <w:tcBorders>
+              <w:top w:val="single" w:sz="4" w:space="0" w:color="C9D6E3"/>
+              <w:left w:val="single" w:sz="4" w:space="0" w:color="C9D6E3"/>
+              <w:bottom w:val="single" w:sz="4" w:space="0" w:color="C9D6E3"/>
+              <w:right w:val="single" w:sz="4" w:space="0" w:color="C9D6E3"/>
+            </w:tcBorders>
+            <w:shd w:color="auto" w:fill="F3F9FE" w:val="clear"/>
+          </w:tcPr>
+          <w:p>
+            <w:pPr>
+              <w:pStyle w:val="TableText"/>
+              <w:rPr/>
+            </w:pPr>
+            <w:r>
+              <w:rPr>
+                <w:rFonts w:eastAsia="Nunito" w:cs="Nunito"/>
+                <w:sz w:val="17"/>
+              </w:rPr>
+              <w:t>globals</w:t>
+            </w:r>
+          </w:p>
+        </w:tc>
+        <w:tc>
+          <w:tcPr>
+            <w:tcW w:w="1060" w:type="dxa"/>
+            <w:tcBorders>
+              <w:top w:val="single" w:sz="4" w:space="0" w:color="C9D6E3"/>
+              <w:left w:val="single" w:sz="4" w:space="0" w:color="C9D6E3"/>
+              <w:bottom w:val="single" w:sz="4" w:space="0" w:color="C9D6E3"/>
+              <w:right w:val="single" w:sz="4" w:space="0" w:color="C9D6E3"/>
+            </w:tcBorders>
+            <w:shd w:color="auto" w:fill="F3F9FE" w:val="clear"/>
+          </w:tcPr>
+          <w:p>
+            <w:pPr>
+              <w:pStyle w:val="TableText"/>
+              <w:rPr/>
+            </w:pPr>
+            <w:r>
+              <w:rPr>
+                <w:rFonts w:eastAsia="Nunito" w:cs="Nunito"/>
+                <w:sz w:val="17"/>
+              </w:rPr>
+              <w:t>15.15.0</w:t>
+            </w:r>
+          </w:p>
+        </w:tc>
+        <w:tc>
+          <w:tcPr>
+            <w:tcW w:w="1252" w:type="dxa"/>
+            <w:tcBorders>
+              <w:top w:val="single" w:sz="4" w:space="0" w:color="C9D6E3"/>
+              <w:left w:val="single" w:sz="4" w:space="0" w:color="C9D6E3"/>
+              <w:bottom w:val="single" w:sz="4" w:space="0" w:color="C9D6E3"/>
+              <w:right w:val="single" w:sz="4" w:space="0" w:color="C9D6E3"/>
+            </w:tcBorders>
+            <w:shd w:color="auto" w:fill="F3F9FE" w:val="clear"/>
+          </w:tcPr>
+          <w:p>
+            <w:pPr>
+              <w:pStyle w:val="TableText"/>
+              <w:rPr/>
+            </w:pPr>
+            <w:r>
+              <w:rPr>
+                <w:rFonts w:eastAsia="Nunito" w:cs="Nunito"/>
+                <w:sz w:val="17"/>
+              </w:rPr>
+              <w:t>MIT</w:t>
+            </w:r>
+          </w:p>
+        </w:tc>
+        <w:tc>
+          <w:tcPr>
+            <w:tcW w:w="5590" w:type="dxa"/>
+            <w:tcBorders>
+              <w:top w:val="single" w:sz="4" w:space="0" w:color="C9D6E3"/>
+              <w:left w:val="single" w:sz="4" w:space="0" w:color="C9D6E3"/>
+              <w:bottom w:val="single" w:sz="4" w:space="0" w:color="C9D6E3"/>
+              <w:right w:val="single" w:sz="4" w:space="0" w:color="C9D6E3"/>
+            </w:tcBorders>
+            <w:shd w:color="auto" w:fill="F3F9FE" w:val="clear"/>
+          </w:tcPr>
+          <w:p>
+            <w:pPr>
+              <w:pStyle w:val="TableText"/>
+              <w:rPr/>
+            </w:pPr>
+            <w:r>
+              <w:rPr>
+                <w:rFonts w:eastAsia="Nunito" w:cs="Nunito"/>
+                <w:sz w:val="17"/>
+              </w:rPr>
+              <w:t>ESLint environment globals</w:t>
             </w:r>
           </w:p>
         </w:tc>
@@ -5571,7 +5856,7 @@
         <w:pStyle w:val="Heading2"/>
         <w:rPr/>
       </w:pPr>
-      <w:bookmarkStart w:id="6" w:name="__RefHeading___Toc11119_3826153650"/>
+      <w:bookmarkStart w:id="6" w:name="__RefHeading___Toc7540_4084622315"/>
       <w:bookmarkEnd w:id="6"/>
       <w:r>
         <w:rPr>
@@ -5595,8 +5880,8 @@
         <w:tblLook w:val="04a0" w:noHBand="0" w:noVBand="1" w:firstColumn="1" w:lastRow="0" w:lastColumn="0" w:firstRow="1"/>
       </w:tblPr>
       <w:tblGrid>
-        <w:gridCol w:w="2698"/>
-        <w:gridCol w:w="6938"/>
+        <w:gridCol w:w="2891"/>
+        <w:gridCol w:w="6745"/>
       </w:tblGrid>
       <w:tr>
         <w:trPr>
@@ -5605,7 +5890,7 @@
         </w:trPr>
         <w:tc>
           <w:tcPr>
-            <w:tcW w:w="2698" w:type="dxa"/>
+            <w:tcW w:w="2891" w:type="dxa"/>
             <w:tcBorders>
               <w:top w:val="single" w:sz="4" w:space="0" w:color="C9D6E3"/>
               <w:left w:val="single" w:sz="4" w:space="0" w:color="C9D6E3"/>
@@ -5633,7 +5918,7 @@
         </w:tc>
         <w:tc>
           <w:tcPr>
-            <w:tcW w:w="6938" w:type="dxa"/>
+            <w:tcW w:w="6745" w:type="dxa"/>
             <w:tcBorders>
               <w:top w:val="single" w:sz="4" w:space="0" w:color="C9D6E3"/>
               <w:left w:val="single" w:sz="4" w:space="0" w:color="C9D6E3"/>
@@ -5666,7 +5951,7 @@
         </w:trPr>
         <w:tc>
           <w:tcPr>
-            <w:tcW w:w="2698" w:type="dxa"/>
+            <w:tcW w:w="2891" w:type="dxa"/>
             <w:tcBorders>
               <w:top w:val="single" w:sz="4" w:space="0" w:color="C9D6E3"/>
               <w:left w:val="single" w:sz="4" w:space="0" w:color="C9D6E3"/>
@@ -5691,7 +5976,7 @@
         </w:tc>
         <w:tc>
           <w:tcPr>
-            <w:tcW w:w="6938" w:type="dxa"/>
+            <w:tcW w:w="6745" w:type="dxa"/>
             <w:tcBorders>
               <w:top w:val="single" w:sz="4" w:space="0" w:color="C9D6E3"/>
               <w:left w:val="single" w:sz="4" w:space="0" w:color="C9D6E3"/>
@@ -5717,7 +6002,7 @@
                 <w:rFonts w:eastAsia="Nunito" w:cs="Nunito"/>
                 <w:sz w:val="17"/>
               </w:rPr>
-              <w:t>: production configuration check, migrations, seed, HTTP server, scheduler</w:t>
+              <w:t>: production configuration check, migrations under an advisory lock, seed, HTTP server, scheduler</w:t>
             </w:r>
           </w:p>
         </w:tc>
@@ -5728,7 +6013,7 @@
         </w:trPr>
         <w:tc>
           <w:tcPr>
-            <w:tcW w:w="2698" w:type="dxa"/>
+            <w:tcW w:w="2891" w:type="dxa"/>
             <w:tcBorders>
               <w:top w:val="single" w:sz="4" w:space="0" w:color="C9D6E3"/>
               <w:left w:val="single" w:sz="4" w:space="0" w:color="C9D6E3"/>
@@ -5754,7 +6039,7 @@
         </w:tc>
         <w:tc>
           <w:tcPr>
-            <w:tcW w:w="6938" w:type="dxa"/>
+            <w:tcW w:w="6745" w:type="dxa"/>
             <w:tcBorders>
               <w:top w:val="single" w:sz="4" w:space="0" w:color="C9D6E3"/>
               <w:left w:val="single" w:sz="4" w:space="0" w:color="C9D6E3"/>
@@ -5792,7 +6077,7 @@
         </w:trPr>
         <w:tc>
           <w:tcPr>
-            <w:tcW w:w="2698" w:type="dxa"/>
+            <w:tcW w:w="2891" w:type="dxa"/>
             <w:tcBorders>
               <w:top w:val="single" w:sz="4" w:space="0" w:color="C9D6E3"/>
               <w:left w:val="single" w:sz="4" w:space="0" w:color="C9D6E3"/>
@@ -5847,7 +6132,7 @@
         </w:tc>
         <w:tc>
           <w:tcPr>
-            <w:tcW w:w="6938" w:type="dxa"/>
+            <w:tcW w:w="6745" w:type="dxa"/>
             <w:tcBorders>
               <w:top w:val="single" w:sz="4" w:space="0" w:color="C9D6E3"/>
               <w:left w:val="single" w:sz="4" w:space="0" w:color="C9D6E3"/>
@@ -5876,7 +6161,7 @@
         </w:trPr>
         <w:tc>
           <w:tcPr>
-            <w:tcW w:w="2698" w:type="dxa"/>
+            <w:tcW w:w="2891" w:type="dxa"/>
             <w:tcBorders>
               <w:top w:val="single" w:sz="4" w:space="0" w:color="C9D6E3"/>
               <w:left w:val="single" w:sz="4" w:space="0" w:color="C9D6E3"/>
@@ -5902,7 +6187,7 @@
         </w:tc>
         <w:tc>
           <w:tcPr>
-            <w:tcW w:w="6938" w:type="dxa"/>
+            <w:tcW w:w="6745" w:type="dxa"/>
             <w:tcBorders>
               <w:top w:val="single" w:sz="4" w:space="0" w:color="C9D6E3"/>
               <w:left w:val="single" w:sz="4" w:space="0" w:color="C9D6E3"/>
@@ -5921,7 +6206,7 @@
                 <w:rFonts w:eastAsia="Nunito" w:cs="Nunito"/>
                 <w:sz w:val="17"/>
               </w:rPr>
-              <w:t>Generate OpenAPI, Postman and Excel API documentation from the route registry</w:t>
+              <w:t>Write OpenAPI, Postman and Excel API documentation from the route registry</w:t>
             </w:r>
           </w:p>
         </w:tc>
@@ -5932,7 +6217,7 @@
         </w:trPr>
         <w:tc>
           <w:tcPr>
-            <w:tcW w:w="2698" w:type="dxa"/>
+            <w:tcW w:w="2891" w:type="dxa"/>
             <w:tcBorders>
               <w:top w:val="single" w:sz="4" w:space="0" w:color="C9D6E3"/>
               <w:left w:val="single" w:sz="4" w:space="0" w:color="C9D6E3"/>
@@ -5957,25 +6242,25 @@
         </w:tc>
         <w:tc>
           <w:tcPr>
-            <w:tcW w:w="6938" w:type="dxa"/>
-            <w:tcBorders>
-              <w:top w:val="single" w:sz="4" w:space="0" w:color="C9D6E3"/>
-              <w:left w:val="single" w:sz="4" w:space="0" w:color="C9D6E3"/>
-              <w:bottom w:val="single" w:sz="4" w:space="0" w:color="C9D6E3"/>
-              <w:right w:val="single" w:sz="4" w:space="0" w:color="C9D6E3"/>
-            </w:tcBorders>
-          </w:tcPr>
-          <w:p>
-            <w:pPr>
-              <w:pStyle w:val="TableText"/>
-              <w:rPr/>
-            </w:pPr>
-            <w:r>
-              <w:rPr>
-                <w:rFonts w:eastAsia="Nunito" w:cs="Nunito"/>
-                <w:sz w:val="17"/>
-              </w:rPr>
-              <w:t>Remove sample / demo data before go-live (dry run by default)</w:t>
+            <w:tcW w:w="6745" w:type="dxa"/>
+            <w:tcBorders>
+              <w:top w:val="single" w:sz="4" w:space="0" w:color="C9D6E3"/>
+              <w:left w:val="single" w:sz="4" w:space="0" w:color="C9D6E3"/>
+              <w:bottom w:val="single" w:sz="4" w:space="0" w:color="C9D6E3"/>
+              <w:right w:val="single" w:sz="4" w:space="0" w:color="C9D6E3"/>
+            </w:tcBorders>
+          </w:tcPr>
+          <w:p>
+            <w:pPr>
+              <w:pStyle w:val="TableText"/>
+              <w:rPr/>
+            </w:pPr>
+            <w:r>
+              <w:rPr>
+                <w:rFonts w:eastAsia="Nunito" w:cs="Nunito"/>
+                <w:sz w:val="17"/>
+              </w:rPr>
+              <w:t>Remove sample data before go-live (dry run by default)</w:t>
             </w:r>
           </w:p>
         </w:tc>
@@ -5986,7 +6271,7 @@
         </w:trPr>
         <w:tc>
           <w:tcPr>
-            <w:tcW w:w="2698" w:type="dxa"/>
+            <w:tcW w:w="2891" w:type="dxa"/>
             <w:tcBorders>
               <w:top w:val="single" w:sz="4" w:space="0" w:color="C9D6E3"/>
               <w:left w:val="single" w:sz="4" w:space="0" w:color="C9D6E3"/>
@@ -6006,28 +6291,256 @@
                 <w:color w:val="0B3D7A"/>
                 <w:sz w:val="15"/>
               </w:rPr>
-              <w:t>npm test</w:t>
-            </w:r>
-            <w:r>
-              <w:rPr>
-                <w:rFonts w:eastAsia="Nunito" w:cs="Nunito"/>
-                <w:sz w:val="17"/>
-              </w:rPr>
-              <w:t xml:space="preserve">, </w:t>
-            </w:r>
+              <w:t>npm run check:settings</w:t>
+            </w:r>
+          </w:p>
+        </w:tc>
+        <w:tc>
+          <w:tcPr>
+            <w:tcW w:w="6745" w:type="dxa"/>
+            <w:tcBorders>
+              <w:top w:val="single" w:sz="4" w:space="0" w:color="C9D6E3"/>
+              <w:left w:val="single" w:sz="4" w:space="0" w:color="C9D6E3"/>
+              <w:bottom w:val="single" w:sz="4" w:space="0" w:color="C9D6E3"/>
+              <w:right w:val="single" w:sz="4" w:space="0" w:color="C9D6E3"/>
+            </w:tcBorders>
+            <w:shd w:color="auto" w:fill="F3F9FE" w:val="clear"/>
+          </w:tcPr>
+          <w:p>
+            <w:pPr>
+              <w:pStyle w:val="TableText"/>
+              <w:rPr/>
+            </w:pPr>
+            <w:r>
+              <w:rPr>
+                <w:rFonts w:eastAsia="Nunito" w:cs="Nunito"/>
+                <w:sz w:val="17"/>
+              </w:rPr>
+              <w:t>Compare the setting keys read in code with the keys in the database</w:t>
+            </w:r>
+          </w:p>
+        </w:tc>
+      </w:tr>
+      <w:tr>
+        <w:trPr>
+          <w:cantSplit w:val="true"/>
+        </w:trPr>
+        <w:tc>
+          <w:tcPr>
+            <w:tcW w:w="2891" w:type="dxa"/>
+            <w:tcBorders>
+              <w:top w:val="single" w:sz="4" w:space="0" w:color="C9D6E3"/>
+              <w:left w:val="single" w:sz="4" w:space="0" w:color="C9D6E3"/>
+              <w:bottom w:val="single" w:sz="4" w:space="0" w:color="C9D6E3"/>
+              <w:right w:val="single" w:sz="4" w:space="0" w:color="C9D6E3"/>
+            </w:tcBorders>
+          </w:tcPr>
+          <w:p>
+            <w:pPr>
+              <w:pStyle w:val="TableText"/>
+              <w:rPr/>
+            </w:pPr>
             <w:r>
               <w:rPr>
                 <w:rFonts w:eastAsia="Liberation Mono" w:cs="Liberation Mono" w:ascii="Liberation Mono" w:hAnsi="Liberation Mono"/>
                 <w:color w:val="0B3D7A"/>
                 <w:sz w:val="15"/>
               </w:rPr>
+              <w:t>node scripts/provision-users.js</w:t>
+            </w:r>
+          </w:p>
+        </w:tc>
+        <w:tc>
+          <w:tcPr>
+            <w:tcW w:w="6745" w:type="dxa"/>
+            <w:tcBorders>
+              <w:top w:val="single" w:sz="4" w:space="0" w:color="C9D6E3"/>
+              <w:left w:val="single" w:sz="4" w:space="0" w:color="C9D6E3"/>
+              <w:bottom w:val="single" w:sz="4" w:space="0" w:color="C9D6E3"/>
+              <w:right w:val="single" w:sz="4" w:space="0" w:color="C9D6E3"/>
+            </w:tcBorders>
+          </w:tcPr>
+          <w:p>
+            <w:pPr>
+              <w:pStyle w:val="TableText"/>
+              <w:rPr/>
+            </w:pPr>
+            <w:r>
+              <w:rPr>
+                <w:rFonts w:eastAsia="Nunito" w:cs="Nunito"/>
+                <w:sz w:val="17"/>
+              </w:rPr>
+              <w:t>Create named users from a CSV kept outside the repository</w:t>
+            </w:r>
+          </w:p>
+        </w:tc>
+      </w:tr>
+      <w:tr>
+        <w:trPr>
+          <w:cantSplit w:val="true"/>
+        </w:trPr>
+        <w:tc>
+          <w:tcPr>
+            <w:tcW w:w="2891" w:type="dxa"/>
+            <w:tcBorders>
+              <w:top w:val="single" w:sz="4" w:space="0" w:color="C9D6E3"/>
+              <w:left w:val="single" w:sz="4" w:space="0" w:color="C9D6E3"/>
+              <w:bottom w:val="single" w:sz="4" w:space="0" w:color="C9D6E3"/>
+              <w:right w:val="single" w:sz="4" w:space="0" w:color="C9D6E3"/>
+            </w:tcBorders>
+            <w:shd w:color="auto" w:fill="F3F9FE" w:val="clear"/>
+          </w:tcPr>
+          <w:p>
+            <w:pPr>
+              <w:pStyle w:val="TableText"/>
+              <w:rPr/>
+            </w:pPr>
+            <w:r>
+              <w:rPr>
+                <w:rFonts w:eastAsia="Liberation Mono" w:cs="Liberation Mono" w:ascii="Liberation Mono" w:hAnsi="Liberation Mono"/>
+                <w:color w:val="0B3D7A"/>
+                <w:sz w:val="15"/>
+              </w:rPr>
+              <w:t>node scripts/build-upload-templates.js</w:t>
+            </w:r>
+          </w:p>
+        </w:tc>
+        <w:tc>
+          <w:tcPr>
+            <w:tcW w:w="6745" w:type="dxa"/>
+            <w:tcBorders>
+              <w:top w:val="single" w:sz="4" w:space="0" w:color="C9D6E3"/>
+              <w:left w:val="single" w:sz="4" w:space="0" w:color="C9D6E3"/>
+              <w:bottom w:val="single" w:sz="4" w:space="0" w:color="C9D6E3"/>
+              <w:right w:val="single" w:sz="4" w:space="0" w:color="C9D6E3"/>
+            </w:tcBorders>
+            <w:shd w:color="auto" w:fill="F3F9FE" w:val="clear"/>
+          </w:tcPr>
+          <w:p>
+            <w:pPr>
+              <w:pStyle w:val="TableText"/>
+              <w:rPr/>
+            </w:pPr>
+            <w:r>
+              <w:rPr>
+                <w:rFonts w:eastAsia="Nunito" w:cs="Nunito"/>
+                <w:sz w:val="17"/>
+              </w:rPr>
+              <w:t xml:space="preserve">Regenerate the upload templates in </w:t>
+            </w:r>
+            <w:r>
+              <w:rPr>
+                <w:rFonts w:eastAsia="Liberation Mono" w:cs="Liberation Mono" w:ascii="Liberation Mono" w:hAnsi="Liberation Mono"/>
+                <w:color w:val="0B3D7A"/>
+                <w:sz w:val="15"/>
+              </w:rPr>
+              <w:t>docs/templates</w:t>
+            </w:r>
+          </w:p>
+        </w:tc>
+      </w:tr>
+      <w:tr>
+        <w:trPr>
+          <w:cantSplit w:val="true"/>
+        </w:trPr>
+        <w:tc>
+          <w:tcPr>
+            <w:tcW w:w="2891" w:type="dxa"/>
+            <w:tcBorders>
+              <w:top w:val="single" w:sz="4" w:space="0" w:color="C9D6E3"/>
+              <w:left w:val="single" w:sz="4" w:space="0" w:color="C9D6E3"/>
+              <w:bottom w:val="single" w:sz="4" w:space="0" w:color="C9D6E3"/>
+              <w:right w:val="single" w:sz="4" w:space="0" w:color="C9D6E3"/>
+            </w:tcBorders>
+          </w:tcPr>
+          <w:p>
+            <w:pPr>
+              <w:pStyle w:val="TableText"/>
+              <w:rPr/>
+            </w:pPr>
+            <w:r>
+              <w:rPr>
+                <w:rFonts w:eastAsia="Liberation Mono" w:cs="Liberation Mono" w:ascii="Liberation Mono" w:hAnsi="Liberation Mono"/>
+                <w:color w:val="0B3D7A"/>
+                <w:sz w:val="15"/>
+              </w:rPr>
+              <w:t>node scripts/fk-index-report.js</w:t>
+            </w:r>
+          </w:p>
+        </w:tc>
+        <w:tc>
+          <w:tcPr>
+            <w:tcW w:w="6745" w:type="dxa"/>
+            <w:tcBorders>
+              <w:top w:val="single" w:sz="4" w:space="0" w:color="C9D6E3"/>
+              <w:left w:val="single" w:sz="4" w:space="0" w:color="C9D6E3"/>
+              <w:bottom w:val="single" w:sz="4" w:space="0" w:color="C9D6E3"/>
+              <w:right w:val="single" w:sz="4" w:space="0" w:color="C9D6E3"/>
+            </w:tcBorders>
+          </w:tcPr>
+          <w:p>
+            <w:pPr>
+              <w:pStyle w:val="TableText"/>
+              <w:rPr/>
+            </w:pPr>
+            <w:r>
+              <w:rPr>
+                <w:rFonts w:eastAsia="Nunito" w:cs="Nunito"/>
+                <w:sz w:val="17"/>
+              </w:rPr>
+              <w:t>List foreign keys without a supporting index</w:t>
+            </w:r>
+          </w:p>
+        </w:tc>
+      </w:tr>
+      <w:tr>
+        <w:trPr>
+          <w:cantSplit w:val="true"/>
+        </w:trPr>
+        <w:tc>
+          <w:tcPr>
+            <w:tcW w:w="2891" w:type="dxa"/>
+            <w:tcBorders>
+              <w:top w:val="single" w:sz="4" w:space="0" w:color="C9D6E3"/>
+              <w:left w:val="single" w:sz="4" w:space="0" w:color="C9D6E3"/>
+              <w:bottom w:val="single" w:sz="4" w:space="0" w:color="C9D6E3"/>
+              <w:right w:val="single" w:sz="4" w:space="0" w:color="C9D6E3"/>
+            </w:tcBorders>
+            <w:shd w:color="auto" w:fill="F3F9FE" w:val="clear"/>
+          </w:tcPr>
+          <w:p>
+            <w:pPr>
+              <w:pStyle w:val="TableText"/>
+              <w:rPr/>
+            </w:pPr>
+            <w:r>
+              <w:rPr>
+                <w:rFonts w:eastAsia="Liberation Mono" w:cs="Liberation Mono" w:ascii="Liberation Mono" w:hAnsi="Liberation Mono"/>
+                <w:color w:val="0B3D7A"/>
+                <w:sz w:val="15"/>
+              </w:rPr>
+              <w:t>npm test</w:t>
+            </w:r>
+            <w:r>
+              <w:rPr>
+                <w:rFonts w:eastAsia="Nunito" w:cs="Nunito"/>
+                <w:sz w:val="17"/>
+              </w:rPr>
+              <w:t xml:space="preserve">, </w:t>
+            </w:r>
+            <w:r>
+              <w:rPr>
+                <w:rFonts w:eastAsia="Liberation Mono" w:cs="Liberation Mono" w:ascii="Liberation Mono" w:hAnsi="Liberation Mono"/>
+                <w:color w:val="0B3D7A"/>
+                <w:sz w:val="15"/>
+              </w:rPr>
               <w:t>npm run lint</w:t>
             </w:r>
           </w:p>
         </w:tc>
         <w:tc>
           <w:tcPr>
-            <w:tcW w:w="6938" w:type="dxa"/>
+            <w:tcW w:w="6745" w:type="dxa"/>
             <w:tcBorders>
               <w:top w:val="single" w:sz="4" w:space="0" w:color="C9D6E3"/>
               <w:left w:val="single" w:sz="4" w:space="0" w:color="C9D6E3"/>
@@ -6073,7 +6586,7 @@
         </w:pBdr>
         <w:rPr/>
       </w:pPr>
-      <w:bookmarkStart w:id="7" w:name="__RefHeading___Toc11121_3826153650"/>
+      <w:bookmarkStart w:id="7" w:name="__RefHeading___Toc7542_4084622315"/>
       <w:bookmarkEnd w:id="7"/>
       <w:r>
         <w:rPr>
@@ -6087,7 +6600,7 @@
         <w:pStyle w:val="Heading2"/>
         <w:rPr/>
       </w:pPr>
-      <w:bookmarkStart w:id="8" w:name="__RefHeading___Toc11123_3826153650"/>
+      <w:bookmarkStart w:id="8" w:name="__RefHeading___Toc7544_4084622315"/>
       <w:bookmarkEnd w:id="8"/>
       <w:r>
         <w:rPr>
@@ -7817,7 +8330,7 @@
                 <w:rFonts w:eastAsia="Nunito" w:cs="Nunito"/>
                 <w:sz w:val="17"/>
               </w:rPr>
-              <w:t>Calendar views (agent events)</w:t>
+              <w:t>Calendar views (open items)</w:t>
             </w:r>
           </w:p>
         </w:tc>
@@ -7922,7 +8435,7 @@
                 <w:rFonts w:eastAsia="Nunito" w:cs="Nunito"/>
                 <w:sz w:val="17"/>
               </w:rPr>
-              <w:t>Date handling in older screens</w:t>
+              <w:t>Date handling in four older screens</w:t>
             </w:r>
           </w:p>
         </w:tc>
@@ -7951,7 +8464,7 @@
                 <w:rFonts w:eastAsia="Nunito" w:cs="Nunito"/>
                 <w:sz w:val="17"/>
               </w:rPr>
-              <w:t>js-cookie</w:t>
+              <w:t>sass</w:t>
             </w:r>
           </w:p>
         </w:tc>
@@ -7975,7 +8488,7 @@
                 <w:rFonts w:eastAsia="Nunito" w:cs="Nunito"/>
                 <w:sz w:val="17"/>
               </w:rPr>
-              <w:t>3.0.8</w:t>
+              <w:t>1.69.5</w:t>
             </w:r>
           </w:p>
         </w:tc>
@@ -8023,7 +8536,7 @@
                 <w:rFonts w:eastAsia="Nunito" w:cs="Nunito"/>
                 <w:sz w:val="17"/>
               </w:rPr>
-              <w:t>Cookie access (legacy)</w:t>
+              <w:t>SCSS styles and theme</w:t>
             </w:r>
           </w:p>
         </w:tc>
@@ -8053,7 +8566,7 @@
                 <w:rFonts w:eastAsia="Nunito" w:cs="Nunito"/>
                 <w:sz w:val="17"/>
               </w:rPr>
-              <w:t>react-pro-sidebar</w:t>
+              <w:t>@fontsource/nunito</w:t>
             </w:r>
           </w:p>
         </w:tc>
@@ -8078,7 +8591,7 @@
                 <w:rFonts w:eastAsia="Nunito" w:cs="Nunito"/>
                 <w:sz w:val="17"/>
               </w:rPr>
-              <w:t>1.1.0-alpha.1</w:t>
+              <w:t>5.3.0</w:t>
             </w:r>
           </w:p>
         </w:tc>
@@ -8103,7 +8616,7 @@
                 <w:rFonts w:eastAsia="Nunito" w:cs="Nunito"/>
                 <w:sz w:val="17"/>
               </w:rPr>
-              <w:t>MIT</w:t>
+              <w:t>OFL-1.1</w:t>
             </w:r>
           </w:p>
         </w:tc>
@@ -8128,7 +8641,7 @@
                 <w:rFonts w:eastAsia="Nunito" w:cs="Nunito"/>
                 <w:sz w:val="17"/>
               </w:rPr>
-              <w:t>Side menu</w:t>
+              <w:t>Nunito web font, bundled (no external font service)</w:t>
             </w:r>
           </w:p>
         </w:tc>
@@ -8157,7 +8670,7 @@
                 <w:rFonts w:eastAsia="Nunito" w:cs="Nunito"/>
                 <w:sz w:val="17"/>
               </w:rPr>
-              <w:t>sass</w:t>
+              <w:t>redux-logger</w:t>
             </w:r>
           </w:p>
         </w:tc>
@@ -8181,7 +8694,7 @@
                 <w:rFonts w:eastAsia="Nunito" w:cs="Nunito"/>
                 <w:sz w:val="17"/>
               </w:rPr>
-              <w:t>1.69.5</w:t>
+              <w:t>3.0.6</w:t>
             </w:r>
           </w:p>
         </w:tc>
@@ -8229,7 +8742,7 @@
                 <w:rFonts w:eastAsia="Nunito" w:cs="Nunito"/>
                 <w:sz w:val="17"/>
               </w:rPr>
-              <w:t>SCSS styles and theme</w:t>
+              <w:t>Redux logging in development builds only</w:t>
             </w:r>
           </w:p>
         </w:tc>
@@ -8259,7 +8772,7 @@
                 <w:rFonts w:eastAsia="Nunito" w:cs="Nunito"/>
                 <w:sz w:val="17"/>
               </w:rPr>
-              <w:t>@fontsource/nunito</w:t>
+              <w:t>js-cookie, react-pro-sidebar, web-vitals</w:t>
             </w:r>
           </w:p>
         </w:tc>
@@ -8284,7 +8797,7 @@
                 <w:rFonts w:eastAsia="Nunito" w:cs="Nunito"/>
                 <w:sz w:val="17"/>
               </w:rPr>
-              <w:t>5.3.0</w:t>
+              <w:t>3.0.8 / 1.1.0-alpha.1 / 2.1.4</w:t>
             </w:r>
           </w:p>
         </w:tc>
@@ -8309,7 +8822,7 @@
                 <w:rFonts w:eastAsia="Nunito" w:cs="Nunito"/>
                 <w:sz w:val="17"/>
               </w:rPr>
-              <w:t>OFL-1.1</w:t>
+              <w:t>MIT, MIT, Apache-2.0</w:t>
             </w:r>
           </w:p>
         </w:tc>
@@ -8334,213 +8847,22 @@
                 <w:rFonts w:eastAsia="Nunito" w:cs="Nunito"/>
                 <w:sz w:val="17"/>
               </w:rPr>
-              <w:t>Nunito web font, bundled (no external font CDN)</w:t>
-            </w:r>
-          </w:p>
-        </w:tc>
-      </w:tr>
-      <w:tr>
-        <w:trPr>
-          <w:cantSplit w:val="true"/>
-        </w:trPr>
-        <w:tc>
-          <w:tcPr>
-            <w:tcW w:w="2312" w:type="dxa"/>
-            <w:tcBorders>
-              <w:top w:val="single" w:sz="4" w:space="0" w:color="C9D6E3"/>
-              <w:left w:val="single" w:sz="4" w:space="0" w:color="C9D6E3"/>
-              <w:bottom w:val="single" w:sz="4" w:space="0" w:color="C9D6E3"/>
-              <w:right w:val="single" w:sz="4" w:space="0" w:color="C9D6E3"/>
-            </w:tcBorders>
-          </w:tcPr>
-          <w:p>
-            <w:pPr>
-              <w:pStyle w:val="TableText"/>
-              <w:rPr/>
-            </w:pPr>
-            <w:r>
-              <w:rPr>
-                <w:rFonts w:eastAsia="Nunito" w:cs="Nunito"/>
-                <w:sz w:val="17"/>
-              </w:rPr>
-              <w:t>redux-logger</w:t>
-            </w:r>
-          </w:p>
-        </w:tc>
-        <w:tc>
-          <w:tcPr>
-            <w:tcW w:w="1060" w:type="dxa"/>
-            <w:tcBorders>
-              <w:top w:val="single" w:sz="4" w:space="0" w:color="C9D6E3"/>
-              <w:left w:val="single" w:sz="4" w:space="0" w:color="C9D6E3"/>
-              <w:bottom w:val="single" w:sz="4" w:space="0" w:color="C9D6E3"/>
-              <w:right w:val="single" w:sz="4" w:space="0" w:color="C9D6E3"/>
-            </w:tcBorders>
-          </w:tcPr>
-          <w:p>
-            <w:pPr>
-              <w:pStyle w:val="TableText"/>
-              <w:rPr/>
-            </w:pPr>
-            <w:r>
-              <w:rPr>
-                <w:rFonts w:eastAsia="Nunito" w:cs="Nunito"/>
-                <w:sz w:val="17"/>
-              </w:rPr>
-              <w:t>3.0.6</w:t>
-            </w:r>
-          </w:p>
-        </w:tc>
-        <w:tc>
-          <w:tcPr>
-            <w:tcW w:w="1253" w:type="dxa"/>
-            <w:tcBorders>
-              <w:top w:val="single" w:sz="4" w:space="0" w:color="C9D6E3"/>
-              <w:left w:val="single" w:sz="4" w:space="0" w:color="C9D6E3"/>
-              <w:bottom w:val="single" w:sz="4" w:space="0" w:color="C9D6E3"/>
-              <w:right w:val="single" w:sz="4" w:space="0" w:color="C9D6E3"/>
-            </w:tcBorders>
-          </w:tcPr>
-          <w:p>
-            <w:pPr>
-              <w:pStyle w:val="TableText"/>
-              <w:rPr/>
-            </w:pPr>
-            <w:r>
-              <w:rPr>
-                <w:rFonts w:eastAsia="Nunito" w:cs="Nunito"/>
-                <w:sz w:val="17"/>
-              </w:rPr>
-              <w:t>MIT</w:t>
-            </w:r>
-          </w:p>
-        </w:tc>
-        <w:tc>
-          <w:tcPr>
-            <w:tcW w:w="5011" w:type="dxa"/>
-            <w:tcBorders>
-              <w:top w:val="single" w:sz="4" w:space="0" w:color="C9D6E3"/>
-              <w:left w:val="single" w:sz="4" w:space="0" w:color="C9D6E3"/>
-              <w:bottom w:val="single" w:sz="4" w:space="0" w:color="C9D6E3"/>
-              <w:right w:val="single" w:sz="4" w:space="0" w:color="C9D6E3"/>
-            </w:tcBorders>
-          </w:tcPr>
-          <w:p>
-            <w:pPr>
-              <w:pStyle w:val="TableText"/>
-              <w:rPr/>
-            </w:pPr>
-            <w:r>
-              <w:rPr>
-                <w:rFonts w:eastAsia="Nunito" w:cs="Nunito"/>
-                <w:sz w:val="17"/>
-              </w:rPr>
-              <w:t>Redux logging in development builds only</w:t>
-            </w:r>
-          </w:p>
-        </w:tc>
-      </w:tr>
-      <w:tr>
-        <w:trPr>
-          <w:cantSplit w:val="true"/>
-        </w:trPr>
-        <w:tc>
-          <w:tcPr>
-            <w:tcW w:w="2312" w:type="dxa"/>
-            <w:tcBorders>
-              <w:top w:val="single" w:sz="4" w:space="0" w:color="C9D6E3"/>
-              <w:left w:val="single" w:sz="4" w:space="0" w:color="C9D6E3"/>
-              <w:bottom w:val="single" w:sz="4" w:space="0" w:color="C9D6E3"/>
-              <w:right w:val="single" w:sz="4" w:space="0" w:color="C9D6E3"/>
-            </w:tcBorders>
-            <w:shd w:color="auto" w:fill="F3F9FE" w:val="clear"/>
-          </w:tcPr>
-          <w:p>
-            <w:pPr>
-              <w:pStyle w:val="TableText"/>
-              <w:rPr/>
-            </w:pPr>
-            <w:r>
-              <w:rPr>
-                <w:rFonts w:eastAsia="Nunito" w:cs="Nunito"/>
-                <w:sz w:val="17"/>
-              </w:rPr>
-              <w:t>web-vitals</w:t>
-            </w:r>
-          </w:p>
-        </w:tc>
-        <w:tc>
-          <w:tcPr>
-            <w:tcW w:w="1060" w:type="dxa"/>
-            <w:tcBorders>
-              <w:top w:val="single" w:sz="4" w:space="0" w:color="C9D6E3"/>
-              <w:left w:val="single" w:sz="4" w:space="0" w:color="C9D6E3"/>
-              <w:bottom w:val="single" w:sz="4" w:space="0" w:color="C9D6E3"/>
-              <w:right w:val="single" w:sz="4" w:space="0" w:color="C9D6E3"/>
-            </w:tcBorders>
-            <w:shd w:color="auto" w:fill="F3F9FE" w:val="clear"/>
-          </w:tcPr>
-          <w:p>
-            <w:pPr>
-              <w:pStyle w:val="TableText"/>
-              <w:rPr/>
-            </w:pPr>
-            <w:r>
-              <w:rPr>
-                <w:rFonts w:eastAsia="Nunito" w:cs="Nunito"/>
-                <w:sz w:val="17"/>
-              </w:rPr>
-              <w:t>2.1.4</w:t>
-            </w:r>
-          </w:p>
-        </w:tc>
-        <w:tc>
-          <w:tcPr>
-            <w:tcW w:w="1253" w:type="dxa"/>
-            <w:tcBorders>
-              <w:top w:val="single" w:sz="4" w:space="0" w:color="C9D6E3"/>
-              <w:left w:val="single" w:sz="4" w:space="0" w:color="C9D6E3"/>
-              <w:bottom w:val="single" w:sz="4" w:space="0" w:color="C9D6E3"/>
-              <w:right w:val="single" w:sz="4" w:space="0" w:color="C9D6E3"/>
-            </w:tcBorders>
-            <w:shd w:color="auto" w:fill="F3F9FE" w:val="clear"/>
-          </w:tcPr>
-          <w:p>
-            <w:pPr>
-              <w:pStyle w:val="TableText"/>
-              <w:rPr/>
-            </w:pPr>
-            <w:r>
-              <w:rPr>
-                <w:rFonts w:eastAsia="Nunito" w:cs="Nunito"/>
-                <w:sz w:val="17"/>
-              </w:rPr>
-              <w:t>Apache-2.0</w:t>
-            </w:r>
-          </w:p>
-        </w:tc>
-        <w:tc>
-          <w:tcPr>
-            <w:tcW w:w="5011" w:type="dxa"/>
-            <w:tcBorders>
-              <w:top w:val="single" w:sz="4" w:space="0" w:color="C9D6E3"/>
-              <w:left w:val="single" w:sz="4" w:space="0" w:color="C9D6E3"/>
-              <w:bottom w:val="single" w:sz="4" w:space="0" w:color="C9D6E3"/>
-              <w:right w:val="single" w:sz="4" w:space="0" w:color="C9D6E3"/>
-            </w:tcBorders>
-            <w:shd w:color="auto" w:fill="F3F9FE" w:val="clear"/>
-          </w:tcPr>
-          <w:p>
-            <w:pPr>
-              <w:pStyle w:val="TableText"/>
-              <w:rPr/>
-            </w:pPr>
-            <w:r>
-              <w:rPr>
-                <w:rFonts w:eastAsia="Nunito" w:cs="Nunito"/>
-                <w:sz w:val="17"/>
-              </w:rPr>
-              <w:t>Performance metrics hook</w:t>
+              <w:t xml:space="preserve">Listed in </w:t>
+            </w:r>
+            <w:r>
+              <w:rPr>
+                <w:rFonts w:eastAsia="Liberation Mono" w:cs="Liberation Mono" w:ascii="Liberation Mono" w:hAnsi="Liberation Mono"/>
+                <w:color w:val="0B3D7A"/>
+                <w:sz w:val="15"/>
+              </w:rPr>
+              <w:t>package.json</w:t>
+            </w:r>
+            <w:r>
+              <w:rPr>
+                <w:rFonts w:eastAsia="Nunito" w:cs="Nunito"/>
+                <w:sz w:val="17"/>
+              </w:rPr>
+              <w:t xml:space="preserve"> but no longer imported; to be removed with the next dependency update</w:t>
             </w:r>
           </w:p>
         </w:tc>
@@ -8579,7 +8901,7 @@
         <w:rPr>
           <w:rFonts w:eastAsia="Nunito" w:cs="Nunito"/>
         </w:rPr>
-        <w:t xml:space="preserve"> packages are listed under dependencies but are only used by tests.</w:t>
+        <w:t xml:space="preserve"> packages are listed under dependencies but are used only by the 30 front-end tests.</w:t>
       </w:r>
     </w:p>
     <w:p>
@@ -8587,7 +8909,7 @@
         <w:pStyle w:val="Heading2"/>
         <w:rPr/>
       </w:pPr>
-      <w:bookmarkStart w:id="9" w:name="__RefHeading___Toc11125_3826153650"/>
+      <w:bookmarkStart w:id="9" w:name="__RefHeading___Toc7546_4084622315"/>
       <w:bookmarkEnd w:id="9"/>
       <w:r>
         <w:rPr>
@@ -8747,7 +9069,7 @@
                 <w:rFonts w:eastAsia="Nunito" w:cs="Nunito"/>
                 <w:sz w:val="17"/>
               </w:rPr>
-              <w:t xml:space="preserve">); </w:t>
+              <w:t xml:space="preserve">). </w:t>
             </w:r>
             <w:r>
               <w:rPr>
@@ -8792,7 +9114,7 @@
                 <w:rFonts w:eastAsia="Nunito" w:cs="Nunito"/>
                 <w:sz w:val="17"/>
               </w:rPr>
-              <w:t xml:space="preserve"> in the Docker and Render builds</w:t>
+              <w:t>.</w:t>
             </w:r>
           </w:p>
         </w:tc>
@@ -8822,7 +9144,7 @@
                 <w:rFonts w:eastAsia="Nunito" w:cs="Nunito"/>
                 <w:sz w:val="17"/>
               </w:rPr>
-              <w:t>Pipeline</w:t>
+              <w:t>Deployment workflow</w:t>
             </w:r>
           </w:p>
         </w:tc>
@@ -8848,14 +9170,14 @@
                 <w:color w:val="0B3D7A"/>
                 <w:sz w:val="15"/>
               </w:rPr>
-              <w:t>.github/workflows/deploy.yml</w:t>
-            </w:r>
-            <w:r>
-              <w:rPr>
-                <w:rFonts w:eastAsia="Nunito" w:cs="Nunito"/>
-                <w:sz w:val="17"/>
-              </w:rPr>
-              <w:t xml:space="preserve">: on push to </w:t>
+              <w:t>brokerverse/.github/workflows/deploy.yml</w:t>
+            </w:r>
+            <w:r>
+              <w:rPr>
+                <w:rFonts w:eastAsia="Nunito" w:cs="Nunito"/>
+                <w:sz w:val="17"/>
+              </w:rPr>
+              <w:t xml:space="preserve">: on a push or pull request to </w:t>
             </w:r>
             <w:r>
               <w:rPr>
@@ -8870,7 +9192,7 @@
                 <w:rFonts w:eastAsia="Nunito" w:cs="Nunito"/>
                 <w:sz w:val="17"/>
               </w:rPr>
-              <w:t xml:space="preserve">, Node 20, </w:t>
+              <w:t xml:space="preserve">, Node 22, </w:t>
             </w:r>
             <w:r>
               <w:rPr>
@@ -8878,14 +9200,14 @@
                 <w:color w:val="0B3D7A"/>
                 <w:sz w:val="15"/>
               </w:rPr>
-              <w:t>npm install --legacy-peer-deps</w:t>
-            </w:r>
-            <w:r>
-              <w:rPr>
-                <w:rFonts w:eastAsia="Nunito" w:cs="Nunito"/>
-                <w:sz w:val="17"/>
-              </w:rPr>
-              <w:t xml:space="preserve">, build with </w:t>
+              <w:t>npm ci --legacy-peer-deps</w:t>
+            </w:r>
+            <w:r>
+              <w:rPr>
+                <w:rFonts w:eastAsia="Nunito" w:cs="Nunito"/>
+                <w:sz w:val="17"/>
+              </w:rPr>
+              <w:t xml:space="preserve">, </w:t>
             </w:r>
             <w:r>
               <w:rPr>
@@ -8893,14 +9215,14 @@
                 <w:color w:val="0B3D7A"/>
                 <w:sz w:val="15"/>
               </w:rPr>
-              <w:t>CI=false</w:t>
-            </w:r>
-            <w:r>
-              <w:rPr>
-                <w:rFonts w:eastAsia="Nunito" w:cs="Nunito"/>
-                <w:sz w:val="17"/>
-              </w:rPr>
-              <w:t xml:space="preserve">, </w:t>
+              <w:t>craco test</w:t>
+            </w:r>
+            <w:r>
+              <w:rPr>
+                <w:rFonts w:eastAsia="Nunito" w:cs="Nunito"/>
+                <w:sz w:val="17"/>
+              </w:rPr>
+              <w:t xml:space="preserve">, a check that the repository variable </w:t>
             </w:r>
             <w:r>
               <w:rPr>
@@ -8908,14 +9230,14 @@
                 <w:color w:val="0B3D7A"/>
                 <w:sz w:val="15"/>
               </w:rPr>
-              <w:t>aws-actions/configure-aws-credentials@v4</w:t>
-            </w:r>
-            <w:r>
-              <w:rPr>
-                <w:rFonts w:eastAsia="Nunito" w:cs="Nunito"/>
-                <w:sz w:val="17"/>
-              </w:rPr>
-              <w:t xml:space="preserve"> (access keys in secrets), </w:t>
+              <w:t>REACT_APP_BASE_URL</w:t>
+            </w:r>
+            <w:r>
+              <w:rPr>
+                <w:rFonts w:eastAsia="Nunito" w:cs="Nunito"/>
+                <w:sz w:val="17"/>
+              </w:rPr>
+              <w:t xml:space="preserve"> is set (push only), build; on a push to </w:t>
             </w:r>
             <w:r>
               <w:rPr>
@@ -8923,14 +9245,14 @@
                 <w:color w:val="0B3D7A"/>
                 <w:sz w:val="15"/>
               </w:rPr>
-              <w:t>aws s3 sync build/ s3://$S3_BUCKET --delete</w:t>
-            </w:r>
-            <w:r>
-              <w:rPr>
-                <w:rFonts w:eastAsia="Nunito" w:cs="Nunito"/>
-                <w:sz w:val="17"/>
-              </w:rPr>
-              <w:t xml:space="preserve">, </w:t>
+              <w:t>dev</w:t>
+            </w:r>
+            <w:r>
+              <w:rPr>
+                <w:rFonts w:eastAsia="Nunito" w:cs="Nunito"/>
+                <w:sz w:val="17"/>
+              </w:rPr>
+              <w:t xml:space="preserve"> the deploy job syncs </w:t>
             </w:r>
             <w:r>
               <w:rPr>
@@ -8938,7 +9260,104 @@
                 <w:color w:val="0B3D7A"/>
                 <w:sz w:val="15"/>
               </w:rPr>
-              <w:t>aws cloudfront create-invalidation --paths "/*"</w:t>
+              <w:t>build/</w:t>
+            </w:r>
+            <w:r>
+              <w:rPr>
+                <w:rFonts w:eastAsia="Nunito" w:cs="Nunito"/>
+                <w:sz w:val="17"/>
+              </w:rPr>
+              <w:t xml:space="preserve"> to the S3 bucket with </w:t>
+            </w:r>
+            <w:r>
+              <w:rPr>
+                <w:rFonts w:eastAsia="Liberation Mono" w:cs="Liberation Mono" w:ascii="Liberation Mono" w:hAnsi="Liberation Mono"/>
+                <w:color w:val="0B3D7A"/>
+                <w:sz w:val="15"/>
+              </w:rPr>
+              <w:t>--delete</w:t>
+            </w:r>
+            <w:r>
+              <w:rPr>
+                <w:rFonts w:eastAsia="Nunito" w:cs="Nunito"/>
+                <w:sz w:val="17"/>
+              </w:rPr>
+              <w:t xml:space="preserve"> and invalidates CloudFront </w:t>
+            </w:r>
+            <w:r>
+              <w:rPr>
+                <w:rFonts w:eastAsia="Liberation Mono" w:cs="Liberation Mono" w:ascii="Liberation Mono" w:hAnsi="Liberation Mono"/>
+                <w:color w:val="0B3D7A"/>
+                <w:sz w:val="15"/>
+              </w:rPr>
+              <w:t>/*</w:t>
+            </w:r>
+            <w:r>
+              <w:rPr>
+                <w:rFonts w:eastAsia="Nunito" w:cs="Nunito"/>
+                <w:sz w:val="17"/>
+              </w:rPr>
+              <w:t xml:space="preserve">. Secrets: </w:t>
+            </w:r>
+            <w:r>
+              <w:rPr>
+                <w:rFonts w:eastAsia="Liberation Mono" w:cs="Liberation Mono" w:ascii="Liberation Mono" w:hAnsi="Liberation Mono"/>
+                <w:color w:val="0B3D7A"/>
+                <w:sz w:val="15"/>
+              </w:rPr>
+              <w:t>AWS_ACCESS_KEY_ID</w:t>
+            </w:r>
+            <w:r>
+              <w:rPr>
+                <w:rFonts w:eastAsia="Nunito" w:cs="Nunito"/>
+                <w:sz w:val="17"/>
+              </w:rPr>
+              <w:t xml:space="preserve">, </w:t>
+            </w:r>
+            <w:r>
+              <w:rPr>
+                <w:rFonts w:eastAsia="Liberation Mono" w:cs="Liberation Mono" w:ascii="Liberation Mono" w:hAnsi="Liberation Mono"/>
+                <w:color w:val="0B3D7A"/>
+                <w:sz w:val="15"/>
+              </w:rPr>
+              <w:t>AWS_SECRET_ACCESS_KEY</w:t>
+            </w:r>
+            <w:r>
+              <w:rPr>
+                <w:rFonts w:eastAsia="Nunito" w:cs="Nunito"/>
+                <w:sz w:val="17"/>
+              </w:rPr>
+              <w:t xml:space="preserve">, </w:t>
+            </w:r>
+            <w:r>
+              <w:rPr>
+                <w:rFonts w:eastAsia="Liberation Mono" w:cs="Liberation Mono" w:ascii="Liberation Mono" w:hAnsi="Liberation Mono"/>
+                <w:color w:val="0B3D7A"/>
+                <w:sz w:val="15"/>
+              </w:rPr>
+              <w:t>S3_BUCKET</w:t>
+            </w:r>
+            <w:r>
+              <w:rPr>
+                <w:rFonts w:eastAsia="Nunito" w:cs="Nunito"/>
+                <w:sz w:val="17"/>
+              </w:rPr>
+              <w:t xml:space="preserve">, </w:t>
+            </w:r>
+            <w:r>
+              <w:rPr>
+                <w:rFonts w:eastAsia="Liberation Mono" w:cs="Liberation Mono" w:ascii="Liberation Mono" w:hAnsi="Liberation Mono"/>
+                <w:color w:val="0B3D7A"/>
+                <w:sz w:val="15"/>
+              </w:rPr>
+              <w:t>CLOUDFRONT_DISTRIBUTION_ID</w:t>
+            </w:r>
+            <w:r>
+              <w:rPr>
+                <w:rFonts w:eastAsia="Nunito" w:cs="Nunito"/>
+                <w:sz w:val="17"/>
+              </w:rPr>
+              <w:t>.</w:t>
             </w:r>
           </w:p>
         </w:tc>
@@ -8967,7 +9386,7 @@
                 <w:rFonts w:eastAsia="Nunito" w:cs="Nunito"/>
                 <w:sz w:val="17"/>
               </w:rPr>
-              <w:t>Container</w:t>
+              <w:t>Repository CI</w:t>
             </w:r>
           </w:p>
         </w:tc>
@@ -8986,27 +9405,20 @@
               <w:pStyle w:val="TableText"/>
               <w:rPr/>
             </w:pPr>
-            <w:r>
-              <w:rPr>
-                <w:rFonts w:eastAsia="Nunito" w:cs="Nunito"/>
-                <w:sz w:val="17"/>
-              </w:rPr>
-              <w:t xml:space="preserve">Multi-stage </w:t>
-            </w:r>
             <w:r>
               <w:rPr>
                 <w:rFonts w:eastAsia="Liberation Mono" w:cs="Liberation Mono" w:ascii="Liberation Mono" w:hAnsi="Liberation Mono"/>
                 <w:color w:val="0B3D7A"/>
                 <w:sz w:val="15"/>
               </w:rPr>
-              <w:t>Dockerfile</w:t>
-            </w:r>
-            <w:r>
-              <w:rPr>
-                <w:rFonts w:eastAsia="Nunito" w:cs="Nunito"/>
-                <w:sz w:val="17"/>
-              </w:rPr>
-              <w:t xml:space="preserve">: </w:t>
+              <w:t>.github/workflows/ci.yml</w:t>
+            </w:r>
+            <w:r>
+              <w:rPr>
+                <w:rFonts w:eastAsia="Nunito" w:cs="Nunito"/>
+                <w:sz w:val="17"/>
+              </w:rPr>
+              <w:t xml:space="preserve">: on every push to </w:t>
             </w:r>
             <w:r>
               <w:rPr>
@@ -9014,14 +9426,14 @@
                 <w:color w:val="0B3D7A"/>
                 <w:sz w:val="15"/>
               </w:rPr>
-              <w:t>node:22-alpine</w:t>
-            </w:r>
-            <w:r>
-              <w:rPr>
-                <w:rFonts w:eastAsia="Nunito" w:cs="Nunito"/>
-                <w:sz w:val="17"/>
-              </w:rPr>
-              <w:t xml:space="preserve"> build, </w:t>
+              <w:t>brokerverse-platform</w:t>
+            </w:r>
+            <w:r>
+              <w:rPr>
+                <w:rFonts w:eastAsia="Nunito" w:cs="Nunito"/>
+                <w:sz w:val="17"/>
+              </w:rPr>
+              <w:t xml:space="preserve"> or </w:t>
             </w:r>
             <w:r>
               <w:rPr>
@@ -9029,14 +9441,14 @@
                 <w:color w:val="0B3D7A"/>
                 <w:sz w:val="15"/>
               </w:rPr>
-              <w:t>nginx:1.27-alpine</w:t>
-            </w:r>
-            <w:r>
-              <w:rPr>
-                <w:rFonts w:eastAsia="Nunito" w:cs="Nunito"/>
-                <w:sz w:val="17"/>
-              </w:rPr>
-              <w:t xml:space="preserve"> runtime with </w:t>
+              <w:t>main</w:t>
+            </w:r>
+            <w:r>
+              <w:rPr>
+                <w:rFonts w:eastAsia="Nunito" w:cs="Nunito"/>
+                <w:sz w:val="17"/>
+              </w:rPr>
+              <w:t xml:space="preserve"> and on pull requests; backend </w:t>
             </w:r>
             <w:r>
               <w:rPr>
@@ -9044,14 +9456,14 @@
                 <w:color w:val="0B3D7A"/>
                 <w:sz w:val="15"/>
               </w:rPr>
-              <w:t>nginx.conf</w:t>
-            </w:r>
-            <w:r>
-              <w:rPr>
-                <w:rFonts w:eastAsia="Nunito" w:cs="Nunito"/>
-                <w:sz w:val="17"/>
-              </w:rPr>
-              <w:t xml:space="preserve"> (SPA fallback, </w:t>
+              <w:t>npm ci</w:t>
+            </w:r>
+            <w:r>
+              <w:rPr>
+                <w:rFonts w:eastAsia="Nunito" w:cs="Nunito"/>
+                <w:sz w:val="17"/>
+              </w:rPr>
+              <w:t xml:space="preserve">, </w:t>
             </w:r>
             <w:r>
               <w:rPr>
@@ -9059,14 +9471,14 @@
                 <w:color w:val="0B3D7A"/>
                 <w:sz w:val="15"/>
               </w:rPr>
-              <w:t>/static/</w:t>
-            </w:r>
-            <w:r>
-              <w:rPr>
-                <w:rFonts w:eastAsia="Nunito" w:cs="Nunito"/>
-                <w:sz w:val="17"/>
-              </w:rPr>
-              <w:t xml:space="preserve"> cached for one year, </w:t>
+              <w:t>eslint</w:t>
+            </w:r>
+            <w:r>
+              <w:rPr>
+                <w:rFonts w:eastAsia="Nunito" w:cs="Nunito"/>
+                <w:sz w:val="17"/>
+              </w:rPr>
+              <w:t xml:space="preserve">, </w:t>
             </w:r>
             <w:r>
               <w:rPr>
@@ -9074,14 +9486,14 @@
                 <w:color w:val="0B3D7A"/>
                 <w:sz w:val="15"/>
               </w:rPr>
-              <w:t>index.html</w:t>
-            </w:r>
-            <w:r>
-              <w:rPr>
-                <w:rFonts w:eastAsia="Nunito" w:cs="Nunito"/>
-                <w:sz w:val="17"/>
-              </w:rPr>
-              <w:t xml:space="preserve"> </w:t>
+              <w:t>vitest</w:t>
+            </w:r>
+            <w:r>
+              <w:rPr>
+                <w:rFonts w:eastAsia="Nunito" w:cs="Nunito"/>
+                <w:sz w:val="17"/>
+              </w:rPr>
+              <w:t xml:space="preserve"> against a </w:t>
             </w:r>
             <w:r>
               <w:rPr>
@@ -9089,14 +9501,14 @@
                 <w:color w:val="0B3D7A"/>
                 <w:sz w:val="15"/>
               </w:rPr>
-              <w:t>no-cache</w:t>
-            </w:r>
-            <w:r>
-              <w:rPr>
-                <w:rFonts w:eastAsia="Nunito" w:cs="Nunito"/>
-                <w:sz w:val="17"/>
-              </w:rPr>
-              <w:t xml:space="preserve">, </w:t>
+              <w:t>postgres:16-alpine</w:t>
+            </w:r>
+            <w:r>
+              <w:rPr>
+                <w:rFonts w:eastAsia="Nunito" w:cs="Nunito"/>
+                <w:sz w:val="17"/>
+              </w:rPr>
+              <w:t xml:space="preserve"> service; front end </w:t>
             </w:r>
             <w:r>
               <w:rPr>
@@ -9104,14 +9516,14 @@
                 <w:color w:val="0B3D7A"/>
                 <w:sz w:val="15"/>
               </w:rPr>
-              <w:t>/api/</w:t>
-            </w:r>
-            <w:r>
-              <w:rPr>
-                <w:rFonts w:eastAsia="Nunito" w:cs="Nunito"/>
-                <w:sz w:val="17"/>
-              </w:rPr>
-              <w:t xml:space="preserve"> proxied to the API, </w:t>
+              <w:t>npm ci</w:t>
+            </w:r>
+            <w:r>
+              <w:rPr>
+                <w:rFonts w:eastAsia="Nunito" w:cs="Nunito"/>
+                <w:sz w:val="17"/>
+              </w:rPr>
+              <w:t xml:space="preserve">, </w:t>
             </w:r>
             <w:r>
               <w:rPr>
@@ -9119,6 +9531,181 @@
                 <w:color w:val="0B3D7A"/>
                 <w:sz w:val="15"/>
               </w:rPr>
+              <w:t>craco test</w:t>
+            </w:r>
+            <w:r>
+              <w:rPr>
+                <w:rFonts w:eastAsia="Nunito" w:cs="Nunito"/>
+                <w:sz w:val="17"/>
+              </w:rPr>
+              <w:t>, production build; backend image build after the backend job passes.</w:t>
+            </w:r>
+          </w:p>
+        </w:tc>
+      </w:tr>
+      <w:tr>
+        <w:trPr>
+          <w:cantSplit w:val="true"/>
+        </w:trPr>
+        <w:tc>
+          <w:tcPr>
+            <w:tcW w:w="2698" w:type="dxa"/>
+            <w:tcBorders>
+              <w:top w:val="single" w:sz="4" w:space="0" w:color="C9D6E3"/>
+              <w:left w:val="single" w:sz="4" w:space="0" w:color="C9D6E3"/>
+              <w:bottom w:val="single" w:sz="4" w:space="0" w:color="C9D6E3"/>
+              <w:right w:val="single" w:sz="4" w:space="0" w:color="C9D6E3"/>
+            </w:tcBorders>
+            <w:shd w:color="auto" w:fill="F3F9FE" w:val="clear"/>
+          </w:tcPr>
+          <w:p>
+            <w:pPr>
+              <w:pStyle w:val="TableText"/>
+              <w:rPr/>
+            </w:pPr>
+            <w:r>
+              <w:rPr>
+                <w:rFonts w:eastAsia="Nunito" w:cs="Nunito"/>
+                <w:sz w:val="17"/>
+              </w:rPr>
+              <w:t>Container</w:t>
+            </w:r>
+          </w:p>
+        </w:tc>
+        <w:tc>
+          <w:tcPr>
+            <w:tcW w:w="6938" w:type="dxa"/>
+            <w:tcBorders>
+              <w:top w:val="single" w:sz="4" w:space="0" w:color="C9D6E3"/>
+              <w:left w:val="single" w:sz="4" w:space="0" w:color="C9D6E3"/>
+              <w:bottom w:val="single" w:sz="4" w:space="0" w:color="C9D6E3"/>
+              <w:right w:val="single" w:sz="4" w:space="0" w:color="C9D6E3"/>
+            </w:tcBorders>
+            <w:shd w:color="auto" w:fill="F3F9FE" w:val="clear"/>
+          </w:tcPr>
+          <w:p>
+            <w:pPr>
+              <w:pStyle w:val="TableText"/>
+              <w:rPr/>
+            </w:pPr>
+            <w:r>
+              <w:rPr>
+                <w:rFonts w:eastAsia="Nunito" w:cs="Nunito"/>
+                <w:sz w:val="17"/>
+              </w:rPr>
+              <w:t xml:space="preserve">Multi-stage </w:t>
+            </w:r>
+            <w:r>
+              <w:rPr>
+                <w:rFonts w:eastAsia="Liberation Mono" w:cs="Liberation Mono" w:ascii="Liberation Mono" w:hAnsi="Liberation Mono"/>
+                <w:color w:val="0B3D7A"/>
+                <w:sz w:val="15"/>
+              </w:rPr>
+              <w:t>brokerverse/Dockerfile</w:t>
+            </w:r>
+            <w:r>
+              <w:rPr>
+                <w:rFonts w:eastAsia="Nunito" w:cs="Nunito"/>
+                <w:sz w:val="17"/>
+              </w:rPr>
+              <w:t xml:space="preserve">: </w:t>
+            </w:r>
+            <w:r>
+              <w:rPr>
+                <w:rFonts w:eastAsia="Liberation Mono" w:cs="Liberation Mono" w:ascii="Liberation Mono" w:hAnsi="Liberation Mono"/>
+                <w:color w:val="0B3D7A"/>
+                <w:sz w:val="15"/>
+              </w:rPr>
+              <w:t>node:22-alpine</w:t>
+            </w:r>
+            <w:r>
+              <w:rPr>
+                <w:rFonts w:eastAsia="Nunito" w:cs="Nunito"/>
+                <w:sz w:val="17"/>
+              </w:rPr>
+              <w:t xml:space="preserve"> build, </w:t>
+            </w:r>
+            <w:r>
+              <w:rPr>
+                <w:rFonts w:eastAsia="Liberation Mono" w:cs="Liberation Mono" w:ascii="Liberation Mono" w:hAnsi="Liberation Mono"/>
+                <w:color w:val="0B3D7A"/>
+                <w:sz w:val="15"/>
+              </w:rPr>
+              <w:t>nginx:1.27-alpine</w:t>
+            </w:r>
+            <w:r>
+              <w:rPr>
+                <w:rFonts w:eastAsia="Nunito" w:cs="Nunito"/>
+                <w:sz w:val="17"/>
+              </w:rPr>
+              <w:t xml:space="preserve"> runtime with </w:t>
+            </w:r>
+            <w:r>
+              <w:rPr>
+                <w:rFonts w:eastAsia="Liberation Mono" w:cs="Liberation Mono" w:ascii="Liberation Mono" w:hAnsi="Liberation Mono"/>
+                <w:color w:val="0B3D7A"/>
+                <w:sz w:val="15"/>
+              </w:rPr>
+              <w:t>nginx.conf</w:t>
+            </w:r>
+            <w:r>
+              <w:rPr>
+                <w:rFonts w:eastAsia="Nunito" w:cs="Nunito"/>
+                <w:sz w:val="17"/>
+              </w:rPr>
+              <w:t xml:space="preserve"> (SPA fallback, </w:t>
+            </w:r>
+            <w:r>
+              <w:rPr>
+                <w:rFonts w:eastAsia="Liberation Mono" w:cs="Liberation Mono" w:ascii="Liberation Mono" w:hAnsi="Liberation Mono"/>
+                <w:color w:val="0B3D7A"/>
+                <w:sz w:val="15"/>
+              </w:rPr>
+              <w:t>/static/</w:t>
+            </w:r>
+            <w:r>
+              <w:rPr>
+                <w:rFonts w:eastAsia="Nunito" w:cs="Nunito"/>
+                <w:sz w:val="17"/>
+              </w:rPr>
+              <w:t xml:space="preserve"> cached for one year, </w:t>
+            </w:r>
+            <w:r>
+              <w:rPr>
+                <w:rFonts w:eastAsia="Liberation Mono" w:cs="Liberation Mono" w:ascii="Liberation Mono" w:hAnsi="Liberation Mono"/>
+                <w:color w:val="0B3D7A"/>
+                <w:sz w:val="15"/>
+              </w:rPr>
+              <w:t>index.html</w:t>
+            </w:r>
+            <w:r>
+              <w:rPr>
+                <w:rFonts w:eastAsia="Nunito" w:cs="Nunito"/>
+                <w:sz w:val="17"/>
+              </w:rPr>
+              <w:t xml:space="preserve"> not cached, </w:t>
+            </w:r>
+            <w:r>
+              <w:rPr>
+                <w:rFonts w:eastAsia="Liberation Mono" w:cs="Liberation Mono" w:ascii="Liberation Mono" w:hAnsi="Liberation Mono"/>
+                <w:color w:val="0B3D7A"/>
+                <w:sz w:val="15"/>
+              </w:rPr>
+              <w:t>/api/</w:t>
+            </w:r>
+            <w:r>
+              <w:rPr>
+                <w:rFonts w:eastAsia="Nunito" w:cs="Nunito"/>
+                <w:sz w:val="17"/>
+              </w:rPr>
+              <w:t xml:space="preserve"> proxied to the API, </w:t>
+            </w:r>
+            <w:r>
+              <w:rPr>
+                <w:rFonts w:eastAsia="Liberation Mono" w:cs="Liberation Mono" w:ascii="Liberation Mono" w:hAnsi="Liberation Mono"/>
+                <w:color w:val="0B3D7A"/>
+                <w:sz w:val="15"/>
+              </w:rPr>
               <w:t>client_max_body_size 25m</w:t>
             </w:r>
             <w:r>
@@ -9126,7 +9713,7 @@
                 <w:rFonts w:eastAsia="Nunito" w:cs="Nunito"/>
                 <w:sz w:val="17"/>
               </w:rPr>
-              <w:t>, security headers)</w:t>
+              <w:t>, security headers).</w:t>
             </w:r>
           </w:p>
         </w:tc>
@@ -9153,7 +9740,7 @@
         </w:pBdr>
         <w:rPr/>
       </w:pPr>
-      <w:bookmarkStart w:id="10" w:name="__RefHeading___Toc11127_3826153650"/>
+      <w:bookmarkStart w:id="10" w:name="__RefHeading___Toc7548_4084622315"/>
       <w:bookmarkEnd w:id="10"/>
       <w:r>
         <w:rPr>
@@ -9334,7 +9921,7 @@
                 <w:rFonts w:eastAsia="Nunito" w:cs="Nunito"/>
                 <w:sz w:val="17"/>
               </w:rPr>
-              <w:t>; local v22.22.2)</w:t>
+              <w:t>)</w:t>
             </w:r>
           </w:p>
         </w:tc>
@@ -9358,7 +9945,7 @@
                 <w:rFonts w:eastAsia="Nunito" w:cs="Nunito"/>
                 <w:sz w:val="17"/>
               </w:rPr>
-              <w:t xml:space="preserve">API runtime. </w:t>
+              <w:t xml:space="preserve">API runtime and both GitHub workflows; </w:t>
             </w:r>
             <w:r>
               <w:rPr>
@@ -9381,14 +9968,14 @@
                 <w:color w:val="0B3D7A"/>
                 <w:sz w:val="15"/>
               </w:rPr>
-              <w:t>package.json</w:t>
-            </w:r>
-            <w:r>
-              <w:rPr>
-                <w:rFonts w:eastAsia="Nunito" w:cs="Nunito"/>
-                <w:sz w:val="17"/>
-              </w:rPr>
-              <w:t xml:space="preserve"> says </w:t>
+              <w:t>backend/package.json</w:t>
+            </w:r>
+            <w:r>
+              <w:rPr>
+                <w:rFonts w:eastAsia="Nunito" w:cs="Nunito"/>
+                <w:sz w:val="17"/>
+              </w:rPr>
+              <w:t xml:space="preserve"> is </w:t>
             </w:r>
             <w:r>
               <w:rPr>
@@ -9396,14 +9983,7 @@
                 <w:color w:val="0B3D7A"/>
                 <w:sz w:val="15"/>
               </w:rPr>
-              <w:t>&gt;=20</w:t>
-            </w:r>
-            <w:r>
-              <w:rPr>
-                <w:rFonts w:eastAsia="Nunito" w:cs="Nunito"/>
-                <w:sz w:val="17"/>
-              </w:rPr>
-              <w:t>; the front-end pipeline builds with Node 20</w:t>
+              <w:t>&gt;=22</w:t>
             </w:r>
           </w:p>
         </w:tc>
@@ -9483,7 +10063,7 @@
                 <w:rFonts w:eastAsia="Nunito" w:cs="Nunito"/>
                 <w:sz w:val="17"/>
               </w:rPr>
-              <w:t>System of record; RDS target (document 07, 09)</w:t>
+              <w:t>System of record; time zone Asia/Manila (documents 07 and 09)</w:t>
             </w:r>
           </w:p>
         </w:tc>
@@ -9590,7 +10170,7 @@
                 <w:rFonts w:eastAsia="Nunito" w:cs="Nunito"/>
                 <w:sz w:val="17"/>
               </w:rPr>
-              <w:t>Docker / Docker Compose</w:t>
+              <w:t>Docker, Docker Compose</w:t>
             </w:r>
           </w:p>
         </w:tc>
@@ -9615,7 +10195,7 @@
                 <w:rFonts w:eastAsia="Nunito" w:cs="Nunito"/>
                 <w:sz w:val="17"/>
               </w:rPr>
-              <w:t>Compose file format without version key</w:t>
+              <w:t>Compose file without a version key</w:t>
             </w:r>
           </w:p>
         </w:tc>
@@ -9640,7 +10220,7 @@
                 <w:rFonts w:eastAsia="Nunito" w:cs="Nunito"/>
                 <w:sz w:val="17"/>
               </w:rPr>
-              <w:t>Local and single-server deployment</w:t>
+              <w:t>Single-server, test and trial installations</w:t>
             </w:r>
           </w:p>
         </w:tc>
@@ -9669,7 +10249,7 @@
                 <w:rFonts w:eastAsia="Nunito" w:cs="Nunito"/>
                 <w:sz w:val="17"/>
               </w:rPr>
-              <w:t>Render</w:t>
+              <w:t>GitHub Actions</w:t>
             </w:r>
           </w:p>
         </w:tc>
@@ -9688,20 +10268,73 @@
               <w:pStyle w:val="TableText"/>
               <w:rPr/>
             </w:pPr>
-            <w:r>
-              <w:rPr>
-                <w:rFonts w:eastAsia="Nunito" w:cs="Nunito"/>
-                <w:sz w:val="17"/>
-              </w:rPr>
-              <w:t xml:space="preserve">Blueprint </w:t>
-            </w:r>
             <w:r>
               <w:rPr>
                 <w:rFonts w:eastAsia="Liberation Mono" w:cs="Liberation Mono" w:ascii="Liberation Mono" w:hAnsi="Liberation Mono"/>
                 <w:color w:val="0B3D7A"/>
                 <w:sz w:val="15"/>
               </w:rPr>
-              <w:t>render.yaml</w:t>
+              <w:t>actions/checkout@v4</w:t>
+            </w:r>
+            <w:r>
+              <w:rPr>
+                <w:rFonts w:eastAsia="Nunito" w:cs="Nunito"/>
+                <w:sz w:val="17"/>
+              </w:rPr>
+              <w:t xml:space="preserve">, </w:t>
+            </w:r>
+            <w:r>
+              <w:rPr>
+                <w:rFonts w:eastAsia="Liberation Mono" w:cs="Liberation Mono" w:ascii="Liberation Mono" w:hAnsi="Liberation Mono"/>
+                <w:color w:val="0B3D7A"/>
+                <w:sz w:val="15"/>
+              </w:rPr>
+              <w:t>setup-node@v4</w:t>
+            </w:r>
+            <w:r>
+              <w:rPr>
+                <w:rFonts w:eastAsia="Nunito" w:cs="Nunito"/>
+                <w:sz w:val="17"/>
+              </w:rPr>
+              <w:t xml:space="preserve">, </w:t>
+            </w:r>
+            <w:r>
+              <w:rPr>
+                <w:rFonts w:eastAsia="Liberation Mono" w:cs="Liberation Mono" w:ascii="Liberation Mono" w:hAnsi="Liberation Mono"/>
+                <w:color w:val="0B3D7A"/>
+                <w:sz w:val="15"/>
+              </w:rPr>
+              <w:t>upload-artifact@v4</w:t>
+            </w:r>
+            <w:r>
+              <w:rPr>
+                <w:rFonts w:eastAsia="Nunito" w:cs="Nunito"/>
+                <w:sz w:val="17"/>
+              </w:rPr>
+              <w:t xml:space="preserve">, </w:t>
+            </w:r>
+            <w:r>
+              <w:rPr>
+                <w:rFonts w:eastAsia="Liberation Mono" w:cs="Liberation Mono" w:ascii="Liberation Mono" w:hAnsi="Liberation Mono"/>
+                <w:color w:val="0B3D7A"/>
+                <w:sz w:val="15"/>
+              </w:rPr>
+              <w:t>download-artifact@v4</w:t>
+            </w:r>
+            <w:r>
+              <w:rPr>
+                <w:rFonts w:eastAsia="Nunito" w:cs="Nunito"/>
+                <w:sz w:val="17"/>
+              </w:rPr>
+              <w:t xml:space="preserve">, </w:t>
+            </w:r>
+            <w:r>
+              <w:rPr>
+                <w:rFonts w:eastAsia="Liberation Mono" w:cs="Liberation Mono" w:ascii="Liberation Mono" w:hAnsi="Liberation Mono"/>
+                <w:color w:val="0B3D7A"/>
+                <w:sz w:val="15"/>
+              </w:rPr>
+              <w:t>configure-aws-credentials@v4</w:t>
             </w:r>
           </w:p>
         </w:tc>
@@ -9725,7 +10358,7 @@
                 <w:rFonts w:eastAsia="Nunito" w:cs="Nunito"/>
                 <w:sz w:val="17"/>
               </w:rPr>
-              <w:t>Managed demo / UAT hosting option</w:t>
+              <w:t>CI and front-end deployment</w:t>
             </w:r>
           </w:p>
         </w:tc>
@@ -9755,7 +10388,7 @@
                 <w:rFonts w:eastAsia="Nunito" w:cs="Nunito"/>
                 <w:sz w:val="17"/>
               </w:rPr>
-              <w:t>GitHub Actions</w:t>
+              <w:t>AWS</w:t>
             </w:r>
           </w:p>
         </w:tc>
@@ -9775,68 +10408,52 @@
               <w:pStyle w:val="TableText"/>
               <w:rPr/>
             </w:pPr>
+            <w:r>
+              <w:rPr>
+                <w:rFonts w:eastAsia="Nunito" w:cs="Nunito"/>
+                <w:sz w:val="17"/>
+              </w:rPr>
+              <w:t>ap-southeast-1</w:t>
+            </w:r>
+          </w:p>
+        </w:tc>
+        <w:tc>
+          <w:tcPr>
+            <w:tcW w:w="5397" w:type="dxa"/>
+            <w:tcBorders>
+              <w:top w:val="single" w:sz="4" w:space="0" w:color="C9D6E3"/>
+              <w:left w:val="single" w:sz="4" w:space="0" w:color="C9D6E3"/>
+              <w:bottom w:val="single" w:sz="4" w:space="0" w:color="C9D6E3"/>
+              <w:right w:val="single" w:sz="4" w:space="0" w:color="C9D6E3"/>
+            </w:tcBorders>
+            <w:shd w:color="auto" w:fill="F3F9FE" w:val="clear"/>
+          </w:tcPr>
+          <w:p>
+            <w:pPr>
+              <w:pStyle w:val="TableText"/>
+              <w:rPr/>
+            </w:pPr>
+            <w:r>
+              <w:rPr>
+                <w:rFonts w:eastAsia="Nunito" w:cs="Nunito"/>
+                <w:sz w:val="17"/>
+              </w:rPr>
+              <w:t xml:space="preserve">S3 and CloudFront for the front end; backend services per </w:t>
+            </w:r>
             <w:r>
               <w:rPr>
                 <w:rFonts w:eastAsia="Liberation Mono" w:cs="Liberation Mono" w:ascii="Liberation Mono" w:hAnsi="Liberation Mono"/>
                 <w:color w:val="0B3D7A"/>
                 <w:sz w:val="15"/>
               </w:rPr>
-              <w:t>actions/checkout@v4</w:t>
-            </w:r>
-            <w:r>
-              <w:rPr>
-                <w:rFonts w:eastAsia="Nunito" w:cs="Nunito"/>
-                <w:sz w:val="17"/>
-              </w:rPr>
-              <w:t xml:space="preserve">, </w:t>
-            </w:r>
-            <w:r>
-              <w:rPr>
-                <w:rFonts w:eastAsia="Liberation Mono" w:cs="Liberation Mono" w:ascii="Liberation Mono" w:hAnsi="Liberation Mono"/>
-                <w:color w:val="0B3D7A"/>
-                <w:sz w:val="15"/>
-              </w:rPr>
-              <w:t>setup-node@v4</w:t>
-            </w:r>
-            <w:r>
-              <w:rPr>
-                <w:rFonts w:eastAsia="Nunito" w:cs="Nunito"/>
-                <w:sz w:val="17"/>
-              </w:rPr>
-              <w:t xml:space="preserve">, </w:t>
-            </w:r>
-            <w:r>
-              <w:rPr>
-                <w:rFonts w:eastAsia="Liberation Mono" w:cs="Liberation Mono" w:ascii="Liberation Mono" w:hAnsi="Liberation Mono"/>
-                <w:color w:val="0B3D7A"/>
-                <w:sz w:val="15"/>
-              </w:rPr>
-              <w:t>configure-aws-credentials@v4</w:t>
-            </w:r>
-          </w:p>
-        </w:tc>
-        <w:tc>
-          <w:tcPr>
-            <w:tcW w:w="5397" w:type="dxa"/>
-            <w:tcBorders>
-              <w:top w:val="single" w:sz="4" w:space="0" w:color="C9D6E3"/>
-              <w:left w:val="single" w:sz="4" w:space="0" w:color="C9D6E3"/>
-              <w:bottom w:val="single" w:sz="4" w:space="0" w:color="C9D6E3"/>
-              <w:right w:val="single" w:sz="4" w:space="0" w:color="C9D6E3"/>
-            </w:tcBorders>
-            <w:shd w:color="auto" w:fill="F3F9FE" w:val="clear"/>
-          </w:tcPr>
-          <w:p>
-            <w:pPr>
-              <w:pStyle w:val="TableText"/>
-              <w:rPr/>
-            </w:pPr>
-            <w:r>
-              <w:rPr>
-                <w:rFonts w:eastAsia="Nunito" w:cs="Nunito"/>
-                <w:sz w:val="17"/>
-              </w:rPr>
-              <w:t>Front-end CI/CD</w:t>
+              <w:t>deploy/README.md</w:t>
+            </w:r>
+            <w:r>
+              <w:rPr>
+                <w:rFonts w:eastAsia="Nunito" w:cs="Nunito"/>
+                <w:sz w:val="17"/>
+              </w:rPr>
+              <w:t xml:space="preserve"> (load balancer, container service, PostgreSQL, persistent volume, secret store)</w:t>
             </w:r>
           </w:p>
         </w:tc>
@@ -9865,7 +10482,7 @@
                 <w:rFonts w:eastAsia="Nunito" w:cs="Nunito"/>
                 <w:sz w:val="17"/>
               </w:rPr>
-              <w:t>AWS</w:t>
+              <w:t>Office 365</w:t>
             </w:r>
           </w:p>
         </w:tc>
@@ -9889,7 +10506,7 @@
                 <w:rFonts w:eastAsia="Nunito" w:cs="Nunito"/>
                 <w:sz w:val="17"/>
               </w:rPr>
-              <w:t>ap-southeast-1</w:t>
+              <w:t>SMTP submission</w:t>
             </w:r>
           </w:p>
         </w:tc>
@@ -9913,7 +10530,15 @@
                 <w:rFonts w:eastAsia="Nunito" w:cs="Nunito"/>
                 <w:sz w:val="17"/>
               </w:rPr>
-              <w:t>S3 and CloudFront in use for the front end; backend services per the go-live checklist (ALB, ECS / App Runner / EC2, RDS, EFS, Secrets Manager or SSM)</w:t>
+              <w:t xml:space="preserve">Outbound e-mail from </w:t>
+            </w:r>
+            <w:r>
+              <w:rPr>
+                <w:rFonts w:eastAsia="Liberation Mono" w:cs="Liberation Mono" w:ascii="Liberation Mono" w:hAnsi="Liberation Mono"/>
+                <w:color w:val="0B3D7A"/>
+                <w:sz w:val="15"/>
+              </w:rPr>
+              <w:t>connect@iortatechnxt.com</w:t>
             </w:r>
           </w:p>
         </w:tc>
@@ -10020,7 +10645,7 @@
         </w:pBdr>
         <w:rPr/>
       </w:pPr>
-      <w:bookmarkStart w:id="11" w:name="__RefHeading___Toc11129_3826153650"/>
+      <w:bookmarkStart w:id="11" w:name="__RefHeading___Toc7550_4084622315"/>
       <w:bookmarkEnd w:id="11"/>
       <w:r>
         <w:rPr>
@@ -10182,7 +10807,7 @@
                 <w:rFonts w:eastAsia="Nunito" w:cs="Nunito"/>
                 <w:sz w:val="17"/>
               </w:rPr>
-              <w:t xml:space="preserve"> reported 0 backend advisories after nodemailer 10 and node-cron 4 upgrades (29 Sep 2026).</w:t>
+              <w:t xml:space="preserve"> reported no backend advisories after the nodemailer 10 and node-cron 4 upgrades (29 Sep 2026).</w:t>
             </w:r>
           </w:p>
         </w:tc>
@@ -10237,7 +10862,7 @@
                 <w:rFonts w:eastAsia="Nunito" w:cs="Nunito"/>
                 <w:sz w:val="17"/>
               </w:rPr>
-              <w:t>71 advisories remain (3 critical, 35 high), almost all build-time transitive dependencies of react-scripts 5.0.1; react-router 6 and craco have moderate advisories. Create React App is no longer maintained; a migration to Vite (or another maintained tool chain) and React Router 7 is the planned remediation.</w:t>
+              <w:t>71 advisories were reported at the review (3 critical, 35 high), almost all build-time dependencies of react-scripts 5.0.1; react-router 6 and craco have moderate ones. Create React App is no longer maintained. A move to Vite (and later React Router 7) is the planned remedy; to be scheduled.</w:t>
             </w:r>
           </w:p>
         </w:tc>
@@ -10266,7 +10891,7 @@
                 <w:rFonts w:eastAsia="Nunito" w:cs="Nunito"/>
                 <w:sz w:val="17"/>
               </w:rPr>
-              <w:t>Node.js versions</w:t>
+              <w:t>Pipeline credentials</w:t>
             </w:r>
           </w:p>
         </w:tc>
@@ -10290,7 +10915,7 @@
                 <w:rFonts w:eastAsia="Nunito" w:cs="Nunito"/>
                 <w:sz w:val="17"/>
               </w:rPr>
-              <w:t>Align the front-end pipeline (Node 20) and the backend image (Node 22); Node 20 reaches end of life on 30 April 2026 per the Node.js release schedule, so move the pipeline to Node 22 LTS (recommended).</w:t>
+              <w:t>The deployment workflow uses long-lived AWS access keys stored as GitHub secrets. Recommended: GitHub OIDC with an IAM role limited to the bucket and the distribution.</w:t>
             </w:r>
           </w:p>
         </w:tc>
@@ -10320,7 +10945,7 @@
                 <w:rFonts w:eastAsia="Nunito" w:cs="Nunito"/>
                 <w:sz w:val="17"/>
               </w:rPr>
-              <w:t>Pipeline credentials</w:t>
+              <w:t>Backend release pipeline</w:t>
             </w:r>
           </w:p>
         </w:tc>
@@ -10345,7 +10970,7 @@
                 <w:rFonts w:eastAsia="Nunito" w:cs="Nunito"/>
                 <w:sz w:val="17"/>
               </w:rPr>
-              <w:t>The workflow uses long-lived AWS access keys stored as GitHub secrets. Recommended: GitHub OIDC with an IAM role limited to the bucket and distribution.</w:t>
+              <w:t>CI builds the backend image but does not push it to a registry. The image registry and the release steps are to be confirmed by DevOps.</w:t>
             </w:r>
           </w:p>
         </w:tc>
@@ -10374,7 +10999,7 @@
                 <w:rFonts w:eastAsia="Nunito" w:cs="Nunito"/>
                 <w:sz w:val="17"/>
               </w:rPr>
-              <w:t>Pipeline tests</w:t>
+              <w:t>Unused front-end packages</w:t>
             </w:r>
           </w:p>
         </w:tc>
@@ -10393,27 +11018,20 @@
               <w:pStyle w:val="TableText"/>
               <w:rPr/>
             </w:pPr>
-            <w:r>
-              <w:rPr>
-                <w:rFonts w:eastAsia="Nunito" w:cs="Nunito"/>
-                <w:sz w:val="17"/>
-              </w:rPr>
-              <w:t xml:space="preserve">The test and SonarQube steps of the workflow are commented out; the workflow edits a </w:t>
-            </w:r>
             <w:r>
               <w:rPr>
                 <w:rFonts w:eastAsia="Liberation Mono" w:cs="Liberation Mono" w:ascii="Liberation Mono" w:hAnsi="Liberation Mono"/>
                 <w:color w:val="0B3D7A"/>
                 <w:sz w:val="15"/>
               </w:rPr>
-              <w:t>tsconfig.json</w:t>
-            </w:r>
-            <w:r>
-              <w:rPr>
-                <w:rFonts w:eastAsia="Nunito" w:cs="Nunito"/>
-                <w:sz w:val="17"/>
-              </w:rPr>
-              <w:t xml:space="preserve"> that the project does not have (harmless, </w:t>
+              <w:t>js-cookie</w:t>
+            </w:r>
+            <w:r>
+              <w:rPr>
+                <w:rFonts w:eastAsia="Nunito" w:cs="Nunito"/>
+                <w:sz w:val="17"/>
+              </w:rPr>
+              <w:t xml:space="preserve">, </w:t>
             </w:r>
             <w:r>
               <w:rPr>
@@ -10421,14 +11039,14 @@
                 <w:color w:val="0B3D7A"/>
                 <w:sz w:val="15"/>
               </w:rPr>
-              <w:t>|| true</w:t>
-            </w:r>
-            <w:r>
-              <w:rPr>
-                <w:rFonts w:eastAsia="Nunito" w:cs="Nunito"/>
-                <w:sz w:val="17"/>
-              </w:rPr>
-              <w:t xml:space="preserve">). Recommended: run </w:t>
+              <w:t>react-pro-sidebar</w:t>
+            </w:r>
+            <w:r>
+              <w:rPr>
+                <w:rFonts w:eastAsia="Nunito" w:cs="Nunito"/>
+                <w:sz w:val="17"/>
+              </w:rPr>
+              <w:t xml:space="preserve"> and </w:t>
             </w:r>
             <w:r>
               <w:rPr>
@@ -10436,14 +11054,29 @@
                 <w:color w:val="0B3D7A"/>
                 <w:sz w:val="15"/>
               </w:rPr>
-              <w:t>npm test</w:t>
-            </w:r>
-            <w:r>
-              <w:rPr>
-                <w:rFonts w:eastAsia="Nunito" w:cs="Nunito"/>
-                <w:sz w:val="17"/>
-              </w:rPr>
-              <w:t xml:space="preserve"> and the backend tests in CI.</w:t>
+              <w:t>web-vitals</w:t>
+            </w:r>
+            <w:r>
+              <w:rPr>
+                <w:rFonts w:eastAsia="Nunito" w:cs="Nunito"/>
+                <w:sz w:val="17"/>
+              </w:rPr>
+              <w:t xml:space="preserve"> are no longer imported; </w:t>
+            </w:r>
+            <w:r>
+              <w:rPr>
+                <w:rFonts w:eastAsia="Liberation Mono" w:cs="Liberation Mono" w:ascii="Liberation Mono" w:hAnsi="Liberation Mono"/>
+                <w:color w:val="0B3D7A"/>
+                <w:sz w:val="15"/>
+              </w:rPr>
+              <w:t>moment</w:t>
+            </w:r>
+            <w:r>
+              <w:rPr>
+                <w:rFonts w:eastAsia="Nunito" w:cs="Nunito"/>
+                <w:sz w:val="17"/>
+              </w:rPr>
+              <w:t xml:space="preserve"> is used by four files. Remove them with the next dependency update.</w:t>
             </w:r>
           </w:p>
         </w:tc>
@@ -10498,7 +11131,7 @@
                 <w:rFonts w:eastAsia="Nunito" w:cs="Nunito"/>
                 <w:sz w:val="17"/>
               </w:rPr>
-              <w:t xml:space="preserve">All listed runtime dependencies use permissive licences (MIT, MIT-0, ISC, BSD-2-Clause, Apache-2.0) and the Nunito font uses the SIL Open Font License; no copyleft licence was found among the direct dependencies. A full transitive licence scan (for example </w:t>
+              <w:t xml:space="preserve">All listed runtime dependencies use permissive licences (MIT, MIT-0, ISC, BSD-2-Clause, Apache-2.0) and the Nunito font the SIL Open Font License; no copyleft licence was found among the direct dependencies. A full scan of indirect dependencies (for example </w:t>
             </w:r>
             <w:r>
               <w:rPr>
@@ -10513,7 +11146,7 @@
                 <w:rFonts w:eastAsia="Nunito" w:cs="Nunito"/>
                 <w:sz w:val="17"/>
               </w:rPr>
-              <w:t>) is recommended before release.</w:t>
+              <w:t>) is recommended before each release.</w:t>
             </w:r>
           </w:p>
         </w:tc>
@@ -10540,7 +11173,7 @@
         </w:pBdr>
         <w:rPr/>
       </w:pPr>
-      <w:bookmarkStart w:id="12" w:name="__RefHeading___Toc11131_3826153650"/>
+      <w:bookmarkStart w:id="12" w:name="__RefHeading___Toc7552_4084622315"/>
       <w:bookmarkEnd w:id="12"/>
       <w:r>
         <w:rPr>
@@ -10558,7 +11191,7 @@
         <w:rPr>
           <w:rFonts w:eastAsia="Nunito" w:cs="Nunito"/>
         </w:rPr>
-        <w:t xml:space="preserve">This document is one of eleven that together form the BrokerVerse Solution Architecture. They are maintained and issued together (source and build: </w:t>
+        <w:t xml:space="preserve">This document is one of eleven that together form the BrokerVerse OOTB Solution Architecture. They are maintained and issued together (source and build: </w:t>
       </w:r>
       <w:r>
         <w:rPr>
@@ -11579,7 +12212,7 @@
         </w:pBdr>
         <w:rPr/>
       </w:pPr>
-      <w:bookmarkStart w:id="13" w:name="__RefHeading___Toc11133_3826153650"/>
+      <w:bookmarkStart w:id="13" w:name="__RefHeading___Toc7554_4084622315"/>
       <w:bookmarkEnd w:id="13"/>
       <w:r>
         <w:rPr>
@@ -11704,7 +12337,7 @@
                 <w:rFonts w:eastAsia="Nunito" w:cs="Nunito"/>
                 <w:sz w:val="17"/>
               </w:rPr>
-              <w:t>ALB</w:t>
+              <w:t>Advisory lock</w:t>
             </w:r>
           </w:p>
         </w:tc>
@@ -11728,7 +12361,7 @@
                 <w:rFonts w:eastAsia="Nunito" w:cs="Nunito"/>
                 <w:sz w:val="17"/>
               </w:rPr>
-              <w:t>Application Load Balancer (AWS): distributes HTTPS requests over the API containers and checks their health.</w:t>
+              <w:t>PostgreSQL application-level lock (pg_try_advisory_lock, pg_advisory_lock) used so a job runs on one API instance at a time and only one instance applies migrations.</w:t>
             </w:r>
           </w:p>
         </w:tc>
@@ -12298,7 +12931,7 @@
                 <w:rFonts w:eastAsia="Nunito" w:cs="Nunito"/>
                 <w:sz w:val="17"/>
               </w:rPr>
-              <w:t>HS256</w:t>
+              <w:t>Housekeeping</w:t>
             </w:r>
           </w:p>
         </w:tc>
@@ -12323,7 +12956,7 @@
                 <w:rFonts w:eastAsia="Nunito" w:cs="Nunito"/>
                 <w:sz w:val="17"/>
               </w:rPr>
-              <w:t>HMAC-SHA256 JSON Web Token signature algorithm, the only one the API accepts.</w:t>
+              <w:t>Daily job that deletes operational rows (job runs, sent e-mails, sign-in history, expired tokens, read notifications) after the retention days in System Settings.</w:t>
             </w:r>
           </w:p>
         </w:tc>
@@ -12352,7 +12985,7 @@
                 <w:rFonts w:eastAsia="Nunito" w:cs="Nunito"/>
                 <w:sz w:val="17"/>
               </w:rPr>
-              <w:t>Migration</w:t>
+              <w:t>HS256</w:t>
             </w:r>
           </w:p>
         </w:tc>
@@ -12376,7 +13009,7 @@
                 <w:rFonts w:eastAsia="Nunito" w:cs="Nunito"/>
                 <w:sz w:val="17"/>
               </w:rPr>
-              <w:t>Numbered SQL file in backend/src/db/migrations applied once, in order, on API start.</w:t>
+              <w:t>HMAC-SHA256 JSON Web Token signature algorithm, the only one the API accepts.</w:t>
             </w:r>
           </w:p>
         </w:tc>
@@ -12460,7 +13093,7 @@
                 <w:rFonts w:eastAsia="Nunito" w:cs="Nunito"/>
                 <w:sz w:val="17"/>
               </w:rPr>
-              <w:t>RDS</w:t>
+              <w:t>Office 365</w:t>
             </w:r>
           </w:p>
         </w:tc>
@@ -12484,7 +13117,7 @@
                 <w:rFonts w:eastAsia="Nunito" w:cs="Nunito"/>
                 <w:sz w:val="17"/>
               </w:rPr>
-              <w:t>Amazon Relational Database Service, the managed PostgreSQL target.</w:t>
+              <w:t>Microsoft 365 mail service; BrokerVerse sends e-mail through smtp.office365.com with the mailbox in SMTP_URL.</w:t>
             </w:r>
           </w:p>
         </w:tc>
@@ -12514,7 +13147,7 @@
                 <w:rFonts w:eastAsia="Nunito" w:cs="Nunito"/>
                 <w:sz w:val="17"/>
               </w:rPr>
-              <w:t>RPO</w:t>
+              <w:t>RDS</w:t>
             </w:r>
           </w:p>
         </w:tc>
@@ -12539,7 +13172,7 @@
                 <w:rFonts w:eastAsia="Nunito" w:cs="Nunito"/>
                 <w:sz w:val="17"/>
               </w:rPr>
-              <w:t>Recovery point objective: the maximum acceptable data loss, measured in time.</w:t>
+              <w:t>Amazon Relational Database Service, the managed PostgreSQL target.</w:t>
             </w:r>
           </w:p>
         </w:tc>
@@ -12568,7 +13201,7 @@
                 <w:rFonts w:eastAsia="Nunito" w:cs="Nunito"/>
                 <w:sz w:val="17"/>
               </w:rPr>
-              <w:t>RTO</w:t>
+              <w:t>RPO</w:t>
             </w:r>
           </w:p>
         </w:tc>
@@ -12592,7 +13225,7 @@
                 <w:rFonts w:eastAsia="Nunito" w:cs="Nunito"/>
                 <w:sz w:val="17"/>
               </w:rPr>
-              <w:t>Recovery time objective: the maximum acceptable time to restore service.</w:t>
+              <w:t>Recovery point objective: the maximum acceptable data loss, measured in time.</w:t>
             </w:r>
           </w:p>
         </w:tc>
@@ -12622,7 +13255,7 @@
                 <w:rFonts w:eastAsia="Nunito" w:cs="Nunito"/>
                 <w:sz w:val="17"/>
               </w:rPr>
-              <w:t>S3</w:t>
+              <w:t>RTO</w:t>
             </w:r>
           </w:p>
         </w:tc>
@@ -12647,7 +13280,7 @@
                 <w:rFonts w:eastAsia="Nunito" w:cs="Nunito"/>
                 <w:sz w:val="17"/>
               </w:rPr>
-              <w:t>Amazon Simple Storage Service: object storage hosting the SPA build (and proposed archive store).</w:t>
+              <w:t>Recovery time objective: the maximum acceptable time to restore service.</w:t>
             </w:r>
           </w:p>
         </w:tc>
@@ -12676,7 +13309,7 @@
                 <w:rFonts w:eastAsia="Nunito" w:cs="Nunito"/>
                 <w:sz w:val="17"/>
               </w:rPr>
-              <w:t>Seed</w:t>
+              <w:t>S3</w:t>
             </w:r>
           </w:p>
         </w:tc>
@@ -12700,7 +13333,7 @@
                 <w:rFonts w:eastAsia="Nunito" w:cs="Nunito"/>
                 <w:sz w:val="17"/>
               </w:rPr>
-              <w:t>Idempotent data load run on every API start: reference data always, sample data only when SEED_SAMPLE_DATA is on.</w:t>
+              <w:t>Amazon Simple Storage Service: object storage hosting the SPA build (and proposed archive store).</w:t>
             </w:r>
           </w:p>
         </w:tc>
@@ -12730,7 +13363,7 @@
                 <w:rFonts w:eastAsia="Nunito" w:cs="Nunito"/>
                 <w:sz w:val="17"/>
               </w:rPr>
-              <w:t>SES</w:t>
+              <w:t>Seed</w:t>
             </w:r>
           </w:p>
         </w:tc>
@@ -12755,7 +13388,7 @@
                 <w:rFonts w:eastAsia="Nunito" w:cs="Nunito"/>
                 <w:sz w:val="17"/>
               </w:rPr>
-              <w:t>Amazon Simple Email Service, a possible SMTP relay.</w:t>
+              <w:t>Idempotent data load run on every API start: reference data always, sample data only when SEED_SAMPLE_DATA is on.</w:t>
             </w:r>
           </w:p>
         </w:tc>
@@ -12946,7 +13579,7 @@
                 <w:rFonts w:eastAsia="Nunito" w:cs="Nunito"/>
                 <w:sz w:val="17"/>
               </w:rPr>
-              <w:t>UAT</w:t>
+              <w:t>zod</w:t>
             </w:r>
           </w:p>
         </w:tc>
@@ -12960,59 +13593,6 @@
               <w:right w:val="single" w:sz="4" w:space="0" w:color="C9D6E3"/>
             </w:tcBorders>
             <w:shd w:color="auto" w:fill="F3F9FE" w:val="clear"/>
-          </w:tcPr>
-          <w:p>
-            <w:pPr>
-              <w:pStyle w:val="TableText"/>
-              <w:rPr/>
-            </w:pPr>
-            <w:r>
-              <w:rPr>
-                <w:rFonts w:eastAsia="Nunito" w:cs="Nunito"/>
-                <w:sz w:val="17"/>
-              </w:rPr>
-              <w:t>User acceptance testing environment.</w:t>
-            </w:r>
-          </w:p>
-        </w:tc>
-      </w:tr>
-      <w:tr>
-        <w:trPr>
-          <w:cantSplit w:val="true"/>
-        </w:trPr>
-        <w:tc>
-          <w:tcPr>
-            <w:tcW w:w="2312" w:type="dxa"/>
-            <w:tcBorders>
-              <w:top w:val="single" w:sz="4" w:space="0" w:color="C9D6E3"/>
-              <w:left w:val="single" w:sz="4" w:space="0" w:color="C9D6E3"/>
-              <w:bottom w:val="single" w:sz="4" w:space="0" w:color="C9D6E3"/>
-              <w:right w:val="single" w:sz="4" w:space="0" w:color="C9D6E3"/>
-            </w:tcBorders>
-          </w:tcPr>
-          <w:p>
-            <w:pPr>
-              <w:pStyle w:val="TableText"/>
-              <w:rPr/>
-            </w:pPr>
-            <w:r>
-              <w:rPr>
-                <w:rFonts w:eastAsia="Nunito" w:cs="Nunito"/>
-                <w:sz w:val="17"/>
-              </w:rPr>
-              <w:t>zod</w:t>
-            </w:r>
-          </w:p>
-        </w:tc>
-        <w:tc>
-          <w:tcPr>
-            <w:tcW w:w="7324" w:type="dxa"/>
-            <w:tcBorders>
-              <w:top w:val="single" w:sz="4" w:space="0" w:color="C9D6E3"/>
-              <w:left w:val="single" w:sz="4" w:space="0" w:color="C9D6E3"/>
-              <w:bottom w:val="single" w:sz="4" w:space="0" w:color="C9D6E3"/>
-              <w:right w:val="single" w:sz="4" w:space="0" w:color="C9D6E3"/>
-            </w:tcBorders>
           </w:tcPr>
           <w:p>
             <w:pPr>
@@ -13201,7 +13781,7 @@
         <w:color w:val="0065B3"/>
         <w:sz w:val="16"/>
       </w:rPr>
-      <w:t>BrokerVerse  |  04 Technology Stack</w:t>
+      <w:t>BrokerVerse OOTB  |  04 Technology Stack</w:t>
     </w:r>
     <w:r>
       <w:rPr>
@@ -13210,7 +13790,7 @@
         <w:sz w:val="16"/>
       </w:rPr>
       <w:tab/>
-      <w:t>Solution Architecture  ·  Version 1.0</w:t>
+      <w:t>Solution Architecture  ·  Version 1.1</w:t>
     </w:r>
   </w:p>
 </w:hdr>

</xml_diff>

<commit_message>
Developer documentation refresh: technical reference with module catalogue and code review guide, architecture and security, data dictionary at migration 0322, API catalogue, architecture set 1.2, developer guide, release notes 1.1
</commit_message>
<xml_diff>
--- a/docs/architecture/04_BrokerVerse_Technology_Stack.docx
+++ b/docs/architecture/04_BrokerVerse_Technology_Stack.docx
@@ -357,7 +357,7 @@
                 <w:rFonts w:eastAsia="Nunito" w:cs="Nunito"/>
                 <w:sz w:val="19"/>
               </w:rPr>
-              <w:t>1.1</w:t>
+              <w:t>1.2</w:t>
             </w:r>
           </w:p>
         </w:tc>
@@ -419,7 +419,7 @@
                 <w:rFonts w:eastAsia="Nunito" w:cs="Nunito"/>
                 <w:sz w:val="19"/>
               </w:rPr>
-              <w:t>29 September 2026</w:t>
+              <w:t>04 October 2026</w:t>
             </w:r>
           </w:p>
         </w:tc>
@@ -795,7 +795,7 @@
                 <w:rFonts w:eastAsia="Nunito" w:cs="Nunito"/>
                 <w:sz w:val="19"/>
               </w:rPr>
-              <w:t>1.1</w:t>
+              <w:t>1.2</w:t>
             </w:r>
           </w:p>
         </w:tc>
@@ -919,7 +919,7 @@
                 <w:rFonts w:eastAsia="Nunito" w:cs="Nunito"/>
                 <w:sz w:val="19"/>
               </w:rPr>
-              <w:t>29 September 2026</w:t>
+              <w:t>04 October 2026</w:t>
             </w:r>
           </w:p>
         </w:tc>
@@ -1405,6 +1405,107 @@
                 <w:sz w:val="18"/>
               </w:rPr>
               <w:t>Updated to the current system: placement journey, co-insurance, posting rules, period end and BIR tax, bank reconciliation, document numbering, commission rate matrix, single PDF engine, uploads and go-live imports, housekeeping, business time zone, broker roles, deployment on the BrokerVerse URL</w:t>
+            </w:r>
+          </w:p>
+        </w:tc>
+      </w:tr>
+      <w:tr>
+        <w:trPr>
+          <w:cantSplit w:val="true"/>
+        </w:trPr>
+        <w:tc>
+          <w:tcPr>
+            <w:tcW w:w="1156" w:type="dxa"/>
+            <w:tcBorders>
+              <w:top w:val="single" w:sz="4" w:space="0" w:color="C9D6E3"/>
+              <w:left w:val="single" w:sz="4" w:space="0" w:color="C9D6E3"/>
+              <w:bottom w:val="single" w:sz="4" w:space="0" w:color="C9D6E3"/>
+              <w:right w:val="single" w:sz="4" w:space="0" w:color="C9D6E3"/>
+            </w:tcBorders>
+          </w:tcPr>
+          <w:p>
+            <w:pPr>
+              <w:pStyle w:val="TableText"/>
+              <w:rPr/>
+            </w:pPr>
+            <w:r>
+              <w:rPr>
+                <w:rFonts w:eastAsia="Nunito" w:cs="Nunito"/>
+                <w:sz w:val="18"/>
+              </w:rPr>
+              <w:t>1.2</w:t>
+            </w:r>
+          </w:p>
+        </w:tc>
+        <w:tc>
+          <w:tcPr>
+            <w:tcW w:w="1734" w:type="dxa"/>
+            <w:tcBorders>
+              <w:top w:val="single" w:sz="4" w:space="0" w:color="C9D6E3"/>
+              <w:left w:val="single" w:sz="4" w:space="0" w:color="C9D6E3"/>
+              <w:bottom w:val="single" w:sz="4" w:space="0" w:color="C9D6E3"/>
+              <w:right w:val="single" w:sz="4" w:space="0" w:color="C9D6E3"/>
+            </w:tcBorders>
+          </w:tcPr>
+          <w:p>
+            <w:pPr>
+              <w:pStyle w:val="TableText"/>
+              <w:rPr/>
+            </w:pPr>
+            <w:r>
+              <w:rPr>
+                <w:rFonts w:eastAsia="Nunito" w:cs="Nunito"/>
+                <w:sz w:val="18"/>
+              </w:rPr>
+              <w:t>04 October 2026</w:t>
+            </w:r>
+          </w:p>
+        </w:tc>
+        <w:tc>
+          <w:tcPr>
+            <w:tcW w:w="1927" w:type="dxa"/>
+            <w:tcBorders>
+              <w:top w:val="single" w:sz="4" w:space="0" w:color="C9D6E3"/>
+              <w:left w:val="single" w:sz="4" w:space="0" w:color="C9D6E3"/>
+              <w:bottom w:val="single" w:sz="4" w:space="0" w:color="C9D6E3"/>
+              <w:right w:val="single" w:sz="4" w:space="0" w:color="C9D6E3"/>
+            </w:tcBorders>
+          </w:tcPr>
+          <w:p>
+            <w:pPr>
+              <w:pStyle w:val="TableText"/>
+              <w:rPr/>
+            </w:pPr>
+            <w:r>
+              <w:rPr>
+                <w:rFonts w:eastAsia="Nunito" w:cs="Nunito"/>
+                <w:sz w:val="18"/>
+              </w:rPr>
+              <w:t>iorta TechNXT</w:t>
+            </w:r>
+          </w:p>
+        </w:tc>
+        <w:tc>
+          <w:tcPr>
+            <w:tcW w:w="4819" w:type="dxa"/>
+            <w:tcBorders>
+              <w:top w:val="single" w:sz="4" w:space="0" w:color="C9D6E3"/>
+              <w:left w:val="single" w:sz="4" w:space="0" w:color="C9D6E3"/>
+              <w:bottom w:val="single" w:sz="4" w:space="0" w:color="C9D6E3"/>
+              <w:right w:val="single" w:sz="4" w:space="0" w:color="C9D6E3"/>
+            </w:tcBorders>
+          </w:tcPr>
+          <w:p>
+            <w:pPr>
+              <w:pStyle w:val="TableText"/>
+              <w:rPr/>
+            </w:pPr>
+            <w:r>
+              <w:rPr>
+                <w:rFonts w:eastAsia="Nunito" w:cs="Nunito"/>
+                <w:sz w:val="18"/>
+              </w:rPr>
+              <w:t>New modules (AML/CFT, BIR, payables and fixed assets, distribution, fleet and marine, My Work, go-live workbench), integration framework, encryption and masking of personal data, branding and e-signatures, release pipeline; database at migration 0322 (reference data), new ER diagrams</w:t>
             </w:r>
           </w:p>
         </w:tc>
@@ -2110,7 +2211,7 @@
             </w:rPr>
             <w:fldChar w:fldCharType="separate"/>
           </w:r>
-          <w:hyperlink w:anchor="__RefHeading___Toc7528_4084622315">
+          <w:hyperlink w:anchor="__RefHeading___Toc18462_1872304043">
             <w:r>
               <w:rPr>
                 <w:webHidden/>
@@ -2118,7 +2219,7 @@
               </w:rPr>
               <w:t>1 Introduction</w:t>
               <w:tab/>
-              <w:t>4</w:t>
+              <w:t>5</w:t>
             </w:r>
           </w:hyperlink>
         </w:p>
@@ -2131,7 +2232,7 @@
             </w:tabs>
             <w:rPr/>
           </w:pPr>
-          <w:hyperlink w:anchor="__RefHeading___Toc7530_4084622315">
+          <w:hyperlink w:anchor="__RefHeading___Toc18464_1872304043">
             <w:r>
               <w:rPr>
                 <w:webHidden/>
@@ -2139,7 +2240,7 @@
               </w:rPr>
               <w:t>1.1 Purpose and scope</w:t>
               <w:tab/>
-              <w:t>4</w:t>
+              <w:t>5</w:t>
             </w:r>
           </w:hyperlink>
         </w:p>
@@ -2152,7 +2253,7 @@
             </w:tabs>
             <w:rPr/>
           </w:pPr>
-          <w:hyperlink w:anchor="__RefHeading___Toc7532_4084622315">
+          <w:hyperlink w:anchor="__RefHeading___Toc18466_1872304043">
             <w:r>
               <w:rPr>
                 <w:webHidden/>
@@ -2160,7 +2261,7 @@
               </w:rPr>
               <w:t>1.2 Stack overview</w:t>
               <w:tab/>
-              <w:t>4</w:t>
+              <w:t>5</w:t>
             </w:r>
           </w:hyperlink>
         </w:p>
@@ -2173,7 +2274,7 @@
             </w:tabs>
             <w:rPr/>
           </w:pPr>
-          <w:hyperlink w:anchor="__RefHeading___Toc7534_4084622315">
+          <w:hyperlink w:anchor="__RefHeading___Toc18468_1872304043">
             <w:r>
               <w:rPr>
                 <w:webHidden/>
@@ -2181,7 +2282,7 @@
               </w:rPr>
               <w:t>2 Backend (backend/)</w:t>
               <w:tab/>
-              <w:t>5</w:t>
+              <w:t>6</w:t>
             </w:r>
           </w:hyperlink>
         </w:p>
@@ -2194,7 +2295,7 @@
             </w:tabs>
             <w:rPr/>
           </w:pPr>
-          <w:hyperlink w:anchor="__RefHeading___Toc7536_4084622315">
+          <w:hyperlink w:anchor="__RefHeading___Toc18470_1872304043">
             <w:r>
               <w:rPr>
                 <w:webHidden/>
@@ -2202,7 +2303,7 @@
               </w:rPr>
               <w:t>2.1 Runtime dependencies</w:t>
               <w:tab/>
-              <w:t>5</w:t>
+              <w:t>6</w:t>
             </w:r>
           </w:hyperlink>
         </w:p>
@@ -2215,7 +2316,7 @@
             </w:tabs>
             <w:rPr/>
           </w:pPr>
-          <w:hyperlink w:anchor="__RefHeading___Toc7538_4084622315">
+          <w:hyperlink w:anchor="__RefHeading___Toc18472_1872304043">
             <w:r>
               <w:rPr>
                 <w:webHidden/>
@@ -2223,7 +2324,7 @@
               </w:rPr>
               <w:t>2.2 Development and test dependencies</w:t>
               <w:tab/>
-              <w:t>5</w:t>
+              <w:t>6</w:t>
             </w:r>
           </w:hyperlink>
         </w:p>
@@ -2236,7 +2337,7 @@
             </w:tabs>
             <w:rPr/>
           </w:pPr>
-          <w:hyperlink w:anchor="__RefHeading___Toc7540_4084622315">
+          <w:hyperlink w:anchor="__RefHeading___Toc18474_1872304043">
             <w:r>
               <w:rPr>
                 <w:webHidden/>
@@ -2244,7 +2345,7 @@
               </w:rPr>
               <w:t>2.3 Scripts and tools</w:t>
               <w:tab/>
-              <w:t>5</w:t>
+              <w:t>6</w:t>
             </w:r>
           </w:hyperlink>
         </w:p>
@@ -2257,7 +2358,7 @@
             </w:tabs>
             <w:rPr/>
           </w:pPr>
-          <w:hyperlink w:anchor="__RefHeading___Toc7542_4084622315">
+          <w:hyperlink w:anchor="__RefHeading___Toc18476_1872304043">
             <w:r>
               <w:rPr>
                 <w:webHidden/>
@@ -2265,7 +2366,7 @@
               </w:rPr>
               <w:t>3 Front end (brokerverse/)</w:t>
               <w:tab/>
-              <w:t>7</w:t>
+              <w:t>8</w:t>
             </w:r>
           </w:hyperlink>
         </w:p>
@@ -2278,7 +2379,7 @@
             </w:tabs>
             <w:rPr/>
           </w:pPr>
-          <w:hyperlink w:anchor="__RefHeading___Toc7544_4084622315">
+          <w:hyperlink w:anchor="__RefHeading___Toc18478_1872304043">
             <w:r>
               <w:rPr>
                 <w:webHidden/>
@@ -2286,7 +2387,7 @@
               </w:rPr>
               <w:t>3.1 Runtime dependencies</w:t>
               <w:tab/>
-              <w:t>7</w:t>
+              <w:t>8</w:t>
             </w:r>
           </w:hyperlink>
         </w:p>
@@ -2299,7 +2400,7 @@
             </w:tabs>
             <w:rPr/>
           </w:pPr>
-          <w:hyperlink w:anchor="__RefHeading___Toc7546_4084622315">
+          <w:hyperlink w:anchor="__RefHeading___Toc18480_1872304043">
             <w:r>
               <w:rPr>
                 <w:webHidden/>
@@ -2307,7 +2408,7 @@
               </w:rPr>
               <w:t>3.2 Build and delivery</w:t>
               <w:tab/>
-              <w:t>7</w:t>
+              <w:t>8</w:t>
             </w:r>
           </w:hyperlink>
         </w:p>
@@ -2320,7 +2421,7 @@
             </w:tabs>
             <w:rPr/>
           </w:pPr>
-          <w:hyperlink w:anchor="__RefHeading___Toc7548_4084622315">
+          <w:hyperlink w:anchor="__RefHeading___Toc18482_1872304043">
             <w:r>
               <w:rPr>
                 <w:webHidden/>
@@ -2328,7 +2429,7 @@
               </w:rPr>
               <w:t>4 Infrastructure and platform</w:t>
               <w:tab/>
-              <w:t>9</w:t>
+              <w:t>10</w:t>
             </w:r>
           </w:hyperlink>
         </w:p>
@@ -2341,7 +2442,7 @@
             </w:tabs>
             <w:rPr/>
           </w:pPr>
-          <w:hyperlink w:anchor="__RefHeading___Toc7550_4084622315">
+          <w:hyperlink w:anchor="__RefHeading___Toc18484_1872304043">
             <w:r>
               <w:rPr>
                 <w:webHidden/>
@@ -2349,7 +2450,7 @@
               </w:rPr>
               <w:t>5 Lifecycle and risk notes</w:t>
               <w:tab/>
-              <w:t>10</w:t>
+              <w:t>11</w:t>
             </w:r>
           </w:hyperlink>
         </w:p>
@@ -2362,7 +2463,7 @@
             </w:tabs>
             <w:rPr/>
           </w:pPr>
-          <w:hyperlink w:anchor="__RefHeading___Toc7552_4084622315">
+          <w:hyperlink w:anchor="__RefHeading___Toc18486_1872304043">
             <w:r>
               <w:rPr>
                 <w:webHidden/>
@@ -2370,7 +2471,7 @@
               </w:rPr>
               <w:t>6 Related documents</w:t>
               <w:tab/>
-              <w:t>11</w:t>
+              <w:t>12</w:t>
             </w:r>
           </w:hyperlink>
         </w:p>
@@ -2383,7 +2484,7 @@
             </w:tabs>
             <w:rPr/>
           </w:pPr>
-          <w:hyperlink w:anchor="__RefHeading___Toc7554_4084622315">
+          <w:hyperlink w:anchor="__RefHeading___Toc18488_1872304043">
             <w:r>
               <w:rPr>
                 <w:webHidden/>
@@ -2391,7 +2492,7 @@
               </w:rPr>
               <w:t>7 Glossary</w:t>
               <w:tab/>
-              <w:t>12</w:t>
+              <w:t>13</w:t>
             </w:r>
           </w:hyperlink>
           <w:r>
@@ -2414,7 +2515,7 @@
       <w:r>
         <w:br w:type="page"/>
       </w:r>
-      <w:bookmarkStart w:id="0" w:name="__RefHeading___Toc7528_4084622315"/>
+      <w:bookmarkStart w:id="0" w:name="__RefHeading___Toc18462_1872304043"/>
       <w:bookmarkEnd w:id="0"/>
       <w:r>
         <w:rPr>
@@ -2428,7 +2529,7 @@
         <w:pStyle w:val="Heading2"/>
         <w:rPr/>
       </w:pPr>
-      <w:bookmarkStart w:id="1" w:name="__RefHeading___Toc7530_4084622315"/>
+      <w:bookmarkStart w:id="1" w:name="__RefHeading___Toc18464_1872304043"/>
       <w:bookmarkEnd w:id="1"/>
       <w:r>
         <w:rPr>
@@ -2550,7 +2651,7 @@
           <w:color w:val="0B3D7A"/>
           <w:sz w:val="18"/>
         </w:rPr>
-        <w:t>brokerverse/nginx.conf</w:t>
+        <w:t>brokerverse/nginx/default.conf.template</w:t>
       </w:r>
       <w:r>
         <w:rPr>
@@ -2634,7 +2735,7 @@
         <w:pStyle w:val="Heading2"/>
         <w:rPr/>
       </w:pPr>
-      <w:bookmarkStart w:id="2" w:name="__RefHeading___Toc7532_4084622315"/>
+      <w:bookmarkStart w:id="2" w:name="__RefHeading___Toc18466_1872304043"/>
       <w:bookmarkEnd w:id="2"/>
       <w:r>
         <w:rPr>
@@ -3443,7 +3544,7 @@
         </w:pBdr>
         <w:rPr/>
       </w:pPr>
-      <w:bookmarkStart w:id="3" w:name="__RefHeading___Toc7534_4084622315"/>
+      <w:bookmarkStart w:id="3" w:name="__RefHeading___Toc18468_1872304043"/>
       <w:bookmarkEnd w:id="3"/>
       <w:r>
         <w:rPr>
@@ -3457,7 +3558,7 @@
         <w:pStyle w:val="Heading2"/>
         <w:rPr/>
       </w:pPr>
-      <w:bookmarkStart w:id="4" w:name="__RefHeading___Toc7536_4084622315"/>
+      <w:bookmarkStart w:id="4" w:name="__RefHeading___Toc18470_1872304043"/>
       <w:bookmarkEnd w:id="4"/>
       <w:r>
         <w:rPr>
@@ -5206,7 +5307,7 @@
         <w:pStyle w:val="Heading2"/>
         <w:rPr/>
       </w:pPr>
-      <w:bookmarkStart w:id="5" w:name="__RefHeading___Toc7538_4084622315"/>
+      <w:bookmarkStart w:id="5" w:name="__RefHeading___Toc18472_1872304043"/>
       <w:bookmarkEnd w:id="5"/>
       <w:r>
         <w:rPr>
@@ -5856,7 +5957,7 @@
         <w:pStyle w:val="Heading2"/>
         <w:rPr/>
       </w:pPr>
-      <w:bookmarkStart w:id="6" w:name="__RefHeading___Toc7540_4084622315"/>
+      <w:bookmarkStart w:id="6" w:name="__RefHeading___Toc18474_1872304043"/>
       <w:bookmarkEnd w:id="6"/>
       <w:r>
         <w:rPr>
@@ -6291,7 +6392,7 @@
                 <w:color w:val="0B3D7A"/>
                 <w:sz w:val="15"/>
               </w:rPr>
-              <w:t>npm run check:settings</w:t>
+              <w:t>npm run reset:transactions</w:t>
             </w:r>
           </w:p>
         </w:tc>
@@ -6316,7 +6417,22 @@
                 <w:rFonts w:eastAsia="Nunito" w:cs="Nunito"/>
                 <w:sz w:val="17"/>
               </w:rPr>
-              <w:t>Compare the setting keys read in code with the keys in the database</w:t>
+              <w:t xml:space="preserve">Remove the transactions of a smoke test, keeping masters, configuration and users (dry run by default; refused once </w:t>
+            </w:r>
+            <w:r>
+              <w:rPr>
+                <w:rFonts w:eastAsia="Liberation Mono" w:cs="Liberation Mono" w:ascii="Liberation Mono" w:hAnsi="Liberation Mono"/>
+                <w:color w:val="0B3D7A"/>
+                <w:sz w:val="15"/>
+              </w:rPr>
+              <w:t>golive.locked</w:t>
+            </w:r>
+            <w:r>
+              <w:rPr>
+                <w:rFonts w:eastAsia="Nunito" w:cs="Nunito"/>
+                <w:sz w:val="17"/>
+              </w:rPr>
+              <w:t xml:space="preserve"> is on)</w:t>
             </w:r>
           </w:p>
         </w:tc>
@@ -6346,7 +6462,7 @@
                 <w:color w:val="0B3D7A"/>
                 <w:sz w:val="15"/>
               </w:rPr>
-              <w:t>node scripts/provision-users.js</w:t>
+              <w:t>npm run check:settings</w:t>
             </w:r>
           </w:p>
         </w:tc>
@@ -6370,7 +6486,7 @@
                 <w:rFonts w:eastAsia="Nunito" w:cs="Nunito"/>
                 <w:sz w:val="17"/>
               </w:rPr>
-              <w:t>Create named users from a CSV kept outside the repository</w:t>
+              <w:t>Compare the setting keys read in code with the keys in the database</w:t>
             </w:r>
           </w:p>
         </w:tc>
@@ -6401,7 +6517,7 @@
                 <w:color w:val="0B3D7A"/>
                 <w:sz w:val="15"/>
               </w:rPr>
-              <w:t>node scripts/build-upload-templates.js</w:t>
+              <w:t>node scripts/provision-users.js</w:t>
             </w:r>
           </w:p>
         </w:tc>
@@ -6426,15 +6542,7 @@
                 <w:rFonts w:eastAsia="Nunito" w:cs="Nunito"/>
                 <w:sz w:val="17"/>
               </w:rPr>
-              <w:t xml:space="preserve">Regenerate the upload templates in </w:t>
-            </w:r>
-            <w:r>
-              <w:rPr>
-                <w:rFonts w:eastAsia="Liberation Mono" w:cs="Liberation Mono" w:ascii="Liberation Mono" w:hAnsi="Liberation Mono"/>
-                <w:color w:val="0B3D7A"/>
-                <w:sz w:val="15"/>
-              </w:rPr>
-              <w:t>docs/templates</w:t>
+              <w:t>Create named users from a CSV kept outside the repository</w:t>
             </w:r>
           </w:p>
         </w:tc>
@@ -6464,7 +6572,7 @@
                 <w:color w:val="0B3D7A"/>
                 <w:sz w:val="15"/>
               </w:rPr>
-              <w:t>node scripts/fk-index-report.js</w:t>
+              <w:t>node scripts/build-upload-templates.js</w:t>
             </w:r>
           </w:p>
         </w:tc>
@@ -6488,7 +6596,15 @@
                 <w:rFonts w:eastAsia="Nunito" w:cs="Nunito"/>
                 <w:sz w:val="17"/>
               </w:rPr>
-              <w:t>List foreign keys without a supporting index</w:t>
+              <w:t xml:space="preserve">Regenerate the upload templates in </w:t>
+            </w:r>
+            <w:r>
+              <w:rPr>
+                <w:rFonts w:eastAsia="Liberation Mono" w:cs="Liberation Mono" w:ascii="Liberation Mono" w:hAnsi="Liberation Mono"/>
+                <w:color w:val="0B3D7A"/>
+                <w:sz w:val="15"/>
+              </w:rPr>
+              <w:t>docs/package/05_Delivery/Upload_Templates</w:t>
             </w:r>
           </w:p>
         </w:tc>
@@ -6519,21 +6635,76 @@
                 <w:color w:val="0B3D7A"/>
                 <w:sz w:val="15"/>
               </w:rPr>
-              <w:t>npm test</w:t>
-            </w:r>
-            <w:r>
-              <w:rPr>
-                <w:rFonts w:eastAsia="Nunito" w:cs="Nunito"/>
-                <w:sz w:val="17"/>
-              </w:rPr>
-              <w:t xml:space="preserve">, </w:t>
-            </w:r>
+              <w:t>node scripts/fk-index-report.js</w:t>
+            </w:r>
+          </w:p>
+        </w:tc>
+        <w:tc>
+          <w:tcPr>
+            <w:tcW w:w="6745" w:type="dxa"/>
+            <w:tcBorders>
+              <w:top w:val="single" w:sz="4" w:space="0" w:color="C9D6E3"/>
+              <w:left w:val="single" w:sz="4" w:space="0" w:color="C9D6E3"/>
+              <w:bottom w:val="single" w:sz="4" w:space="0" w:color="C9D6E3"/>
+              <w:right w:val="single" w:sz="4" w:space="0" w:color="C9D6E3"/>
+            </w:tcBorders>
+            <w:shd w:color="auto" w:fill="F3F9FE" w:val="clear"/>
+          </w:tcPr>
+          <w:p>
+            <w:pPr>
+              <w:pStyle w:val="TableText"/>
+              <w:rPr/>
+            </w:pPr>
+            <w:r>
+              <w:rPr>
+                <w:rFonts w:eastAsia="Nunito" w:cs="Nunito"/>
+                <w:sz w:val="17"/>
+              </w:rPr>
+              <w:t>List foreign keys without a supporting index</w:t>
+            </w:r>
+          </w:p>
+        </w:tc>
+      </w:tr>
+      <w:tr>
+        <w:trPr>
+          <w:cantSplit w:val="true"/>
+        </w:trPr>
+        <w:tc>
+          <w:tcPr>
+            <w:tcW w:w="2891" w:type="dxa"/>
+            <w:tcBorders>
+              <w:top w:val="single" w:sz="4" w:space="0" w:color="C9D6E3"/>
+              <w:left w:val="single" w:sz="4" w:space="0" w:color="C9D6E3"/>
+              <w:bottom w:val="single" w:sz="4" w:space="0" w:color="C9D6E3"/>
+              <w:right w:val="single" w:sz="4" w:space="0" w:color="C9D6E3"/>
+            </w:tcBorders>
+          </w:tcPr>
+          <w:p>
+            <w:pPr>
+              <w:pStyle w:val="TableText"/>
+              <w:rPr/>
+            </w:pPr>
             <w:r>
               <w:rPr>
                 <w:rFonts w:eastAsia="Liberation Mono" w:cs="Liberation Mono" w:ascii="Liberation Mono" w:hAnsi="Liberation Mono"/>
                 <w:color w:val="0B3D7A"/>
                 <w:sz w:val="15"/>
               </w:rPr>
+              <w:t>npm test</w:t>
+            </w:r>
+            <w:r>
+              <w:rPr>
+                <w:rFonts w:eastAsia="Nunito" w:cs="Nunito"/>
+                <w:sz w:val="17"/>
+              </w:rPr>
+              <w:t xml:space="preserve">, </w:t>
+            </w:r>
+            <w:r>
+              <w:rPr>
+                <w:rFonts w:eastAsia="Liberation Mono" w:cs="Liberation Mono" w:ascii="Liberation Mono" w:hAnsi="Liberation Mono"/>
+                <w:color w:val="0B3D7A"/>
+                <w:sz w:val="15"/>
+              </w:rPr>
               <w:t>npm run lint</w:t>
             </w:r>
           </w:p>
@@ -6547,7 +6718,6 @@
               <w:bottom w:val="single" w:sz="4" w:space="0" w:color="C9D6E3"/>
               <w:right w:val="single" w:sz="4" w:space="0" w:color="C9D6E3"/>
             </w:tcBorders>
-            <w:shd w:color="auto" w:fill="F3F9FE" w:val="clear"/>
           </w:tcPr>
           <w:p>
             <w:pPr>
@@ -6586,7 +6756,7 @@
         </w:pBdr>
         <w:rPr/>
       </w:pPr>
-      <w:bookmarkStart w:id="7" w:name="__RefHeading___Toc7542_4084622315"/>
+      <w:bookmarkStart w:id="7" w:name="__RefHeading___Toc18476_1872304043"/>
       <w:bookmarkEnd w:id="7"/>
       <w:r>
         <w:rPr>
@@ -6600,7 +6770,7 @@
         <w:pStyle w:val="Heading2"/>
         <w:rPr/>
       </w:pPr>
-      <w:bookmarkStart w:id="8" w:name="__RefHeading___Toc7544_4084622315"/>
+      <w:bookmarkStart w:id="8" w:name="__RefHeading___Toc18478_1872304043"/>
       <w:bookmarkEnd w:id="8"/>
       <w:r>
         <w:rPr>
@@ -8909,7 +9079,7 @@
         <w:pStyle w:val="Heading2"/>
         <w:rPr/>
       </w:pPr>
-      <w:bookmarkStart w:id="9" w:name="__RefHeading___Toc7546_4084622315"/>
+      <w:bookmarkStart w:id="9" w:name="__RefHeading___Toc18480_1872304043"/>
       <w:bookmarkEnd w:id="9"/>
       <w:r>
         <w:rPr>
@@ -9740,7 +9910,7 @@
         </w:pBdr>
         <w:rPr/>
       </w:pPr>
-      <w:bookmarkStart w:id="10" w:name="__RefHeading___Toc7548_4084622315"/>
+      <w:bookmarkStart w:id="10" w:name="__RefHeading___Toc18482_1872304043"/>
       <w:bookmarkEnd w:id="10"/>
       <w:r>
         <w:rPr>
@@ -10645,7 +10815,7 @@
         </w:pBdr>
         <w:rPr/>
       </w:pPr>
-      <w:bookmarkStart w:id="11" w:name="__RefHeading___Toc7550_4084622315"/>
+      <w:bookmarkStart w:id="11" w:name="__RefHeading___Toc18484_1872304043"/>
       <w:bookmarkEnd w:id="11"/>
       <w:r>
         <w:rPr>
@@ -11173,7 +11343,7 @@
         </w:pBdr>
         <w:rPr/>
       </w:pPr>
-      <w:bookmarkStart w:id="12" w:name="__RefHeading___Toc7552_4084622315"/>
+      <w:bookmarkStart w:id="12" w:name="__RefHeading___Toc18486_1872304043"/>
       <w:bookmarkEnd w:id="12"/>
       <w:r>
         <w:rPr>
@@ -12212,7 +12382,7 @@
         </w:pBdr>
         <w:rPr/>
       </w:pPr>
-      <w:bookmarkStart w:id="13" w:name="__RefHeading___Toc7554_4084622315"/>
+      <w:bookmarkStart w:id="13" w:name="__RefHeading___Toc18488_1872304043"/>
       <w:bookmarkEnd w:id="13"/>
       <w:r>
         <w:rPr>
@@ -13675,7 +13845,7 @@
         <w:color w:val="5B6776"/>
         <w:sz w:val="16"/>
       </w:rPr>
-      <w:t>29 September 2026  ·  Prepared by iorta TechNXT  ·  Confidential</w:t>
+      <w:t>04 October 2026  ·  Prepared by iorta TechNXT  ·  Confidential</w:t>
       <w:tab/>
       <w:t xml:space="preserve">Page </w:t>
     </w:r>
@@ -13693,7 +13863,7 @@
     </w:r>
     <w:r>
       <w:rPr/>
-      <w:t>12</w:t>
+      <w:t>13</w:t>
     </w:r>
     <w:r>
       <w:rPr/>
@@ -13721,7 +13891,7 @@
     </w:r>
     <w:r>
       <w:rPr/>
-      <w:t>12</w:t>
+      <w:t>13</w:t>
     </w:r>
     <w:r>
       <w:rPr/>
@@ -13790,7 +13960,7 @@
         <w:sz w:val="16"/>
       </w:rPr>
       <w:tab/>
-      <w:t>Solution Architecture  ·  Version 1.1</w:t>
+      <w:t>Solution Architecture  ·  Version 1.2</w:t>
     </w:r>
   </w:p>
 </w:hdr>

</xml_diff>